<commit_message>
Agregando CADe_Simu arranque estrella triangulo e imagenes
</commit_message>
<xml_diff>
--- a/Programacion PLC.docx
+++ b/Programacion PLC.docx
@@ -27,7 +27,13 @@
     <w:sdt>
       <w:sdtPr>
         <w:rPr>
-          <w:lang w:val="es-ES"/>
+          <w:rFonts w:asciiTheme="minorHAnsi" w:eastAsiaTheme="minorHAnsi" w:hAnsiTheme="minorHAnsi" w:cstheme="minorBidi"/>
+          <w:color w:val="auto"/>
+          <w:kern w:val="2"/>
+          <w:sz w:val="22"/>
+          <w:szCs w:val="22"/>
+          <w:lang w:val="es-ES" w:eastAsia="en-US"/>
+          <w14:ligatures w14:val="standardContextual"/>
         </w:rPr>
         <w:id w:val="-146747517"/>
         <w:docPartObj>
@@ -37,15 +43,8 @@
       </w:sdtPr>
       <w:sdtEndPr>
         <w:rPr>
-          <w:rFonts w:asciiTheme="minorHAnsi" w:eastAsiaTheme="minorHAnsi" w:hAnsiTheme="minorHAnsi" w:cstheme="minorBidi"/>
           <w:b/>
           <w:bCs/>
-          <w:color w:val="auto"/>
-          <w:kern w:val="2"/>
-          <w:sz w:val="22"/>
-          <w:szCs w:val="22"/>
-          <w:lang w:eastAsia="en-US"/>
-          <w14:ligatures w14:val="standardContextual"/>
         </w:rPr>
       </w:sdtEndPr>
       <w:sdtContent>
@@ -67,7 +66,11 @@
               <w:tab w:val="right" w:leader="dot" w:pos="8494"/>
             </w:tabs>
             <w:rPr>
+              <w:rFonts w:eastAsiaTheme="minorEastAsia"/>
               <w:noProof/>
+              <w:sz w:val="24"/>
+              <w:szCs w:val="24"/>
+              <w:lang w:eastAsia="es-AR"/>
             </w:rPr>
           </w:pPr>
           <w:r>
@@ -79,7 +82,7 @@
           <w:r>
             <w:fldChar w:fldCharType="separate"/>
           </w:r>
-          <w:hyperlink w:anchor="_Toc233718567" w:history="1">
+          <w:hyperlink w:anchor="_Toc235648170" w:history="1">
             <w:r>
               <w:rPr>
                 <w:rStyle w:val="Hipervnculo"/>
@@ -106,7 +109,7 @@
                 <w:noProof/>
                 <w:webHidden/>
               </w:rPr>
-              <w:instrText xml:space="preserve"> PAGEREF _Toc233718567 \h </w:instrText>
+              <w:instrText xml:space="preserve"> PAGEREF _Toc235648170 \h </w:instrText>
             </w:r>
             <w:r>
               <w:rPr>
@@ -144,10 +147,14 @@
               <w:tab w:val="right" w:leader="dot" w:pos="8494"/>
             </w:tabs>
             <w:rPr>
+              <w:rFonts w:eastAsiaTheme="minorEastAsia"/>
               <w:noProof/>
+              <w:sz w:val="24"/>
+              <w:szCs w:val="24"/>
+              <w:lang w:eastAsia="es-AR"/>
             </w:rPr>
           </w:pPr>
-          <w:hyperlink w:anchor="_Toc233718568" w:history="1">
+          <w:hyperlink w:anchor="_Toc235648171" w:history="1">
             <w:r>
               <w:rPr>
                 <w:rStyle w:val="Hipervnculo"/>
@@ -174,7 +181,7 @@
                 <w:noProof/>
                 <w:webHidden/>
               </w:rPr>
-              <w:instrText xml:space="preserve"> PAGEREF _Toc233718568 \h </w:instrText>
+              <w:instrText xml:space="preserve"> PAGEREF _Toc235648171 \h </w:instrText>
             </w:r>
             <w:r>
               <w:rPr>
@@ -206,6 +213,236 @@
           </w:hyperlink>
         </w:p>
         <w:p>
+          <w:pPr>
+            <w:pStyle w:val="TDC1"/>
+            <w:tabs>
+              <w:tab w:val="right" w:leader="dot" w:pos="8494"/>
+            </w:tabs>
+            <w:rPr>
+              <w:rFonts w:eastAsiaTheme="minorEastAsia"/>
+              <w:noProof/>
+              <w:sz w:val="24"/>
+              <w:szCs w:val="24"/>
+              <w:lang w:eastAsia="es-AR"/>
+            </w:rPr>
+          </w:pPr>
+          <w:hyperlink w:anchor="_Toc235648172" w:history="1">
+            <w:r>
+              <w:rPr>
+                <w:rStyle w:val="Hipervnculo"/>
+                <w:noProof/>
+              </w:rPr>
+              <w:t>Clase 2</w:t>
+            </w:r>
+            <w:r>
+              <w:rPr>
+                <w:noProof/>
+                <w:webHidden/>
+              </w:rPr>
+              <w:tab/>
+            </w:r>
+            <w:r>
+              <w:rPr>
+                <w:noProof/>
+                <w:webHidden/>
+              </w:rPr>
+              <w:fldChar w:fldCharType="begin"/>
+            </w:r>
+            <w:r>
+              <w:rPr>
+                <w:noProof/>
+                <w:webHidden/>
+              </w:rPr>
+              <w:instrText xml:space="preserve"> PAGEREF _Toc235648172 \h </w:instrText>
+            </w:r>
+            <w:r>
+              <w:rPr>
+                <w:noProof/>
+                <w:webHidden/>
+              </w:rPr>
+            </w:r>
+            <w:r>
+              <w:rPr>
+                <w:noProof/>
+                <w:webHidden/>
+              </w:rPr>
+              <w:fldChar w:fldCharType="separate"/>
+            </w:r>
+            <w:r>
+              <w:rPr>
+                <w:noProof/>
+                <w:webHidden/>
+              </w:rPr>
+              <w:t>7</w:t>
+            </w:r>
+            <w:r>
+              <w:rPr>
+                <w:noProof/>
+                <w:webHidden/>
+              </w:rPr>
+              <w:fldChar w:fldCharType="end"/>
+            </w:r>
+          </w:hyperlink>
+        </w:p>
+        <w:p>
+          <w:pPr>
+            <w:pStyle w:val="TDC1"/>
+            <w:tabs>
+              <w:tab w:val="right" w:leader="dot" w:pos="8494"/>
+            </w:tabs>
+            <w:rPr>
+              <w:rFonts w:eastAsiaTheme="minorEastAsia"/>
+              <w:noProof/>
+              <w:sz w:val="24"/>
+              <w:szCs w:val="24"/>
+              <w:lang w:eastAsia="es-AR"/>
+            </w:rPr>
+          </w:pPr>
+          <w:hyperlink w:anchor="_Toc235648173" w:history="1">
+            <w:r>
+              <w:rPr>
+                <w:rStyle w:val="Hipervnculo"/>
+                <w:noProof/>
+              </w:rPr>
+              <w:t>Clase 3</w:t>
+            </w:r>
+            <w:r>
+              <w:rPr>
+                <w:noProof/>
+                <w:webHidden/>
+              </w:rPr>
+              <w:tab/>
+            </w:r>
+            <w:r>
+              <w:rPr>
+                <w:noProof/>
+                <w:webHidden/>
+              </w:rPr>
+              <w:fldChar w:fldCharType="begin"/>
+            </w:r>
+            <w:r>
+              <w:rPr>
+                <w:noProof/>
+                <w:webHidden/>
+              </w:rPr>
+              <w:instrText xml:space="preserve"> PAGEREF _Toc235648173 \h </w:instrText>
+            </w:r>
+            <w:r>
+              <w:rPr>
+                <w:noProof/>
+                <w:webHidden/>
+              </w:rPr>
+            </w:r>
+            <w:r>
+              <w:rPr>
+                <w:noProof/>
+                <w:webHidden/>
+              </w:rPr>
+              <w:fldChar w:fldCharType="separate"/>
+            </w:r>
+            <w:r>
+              <w:rPr>
+                <w:noProof/>
+                <w:webHidden/>
+              </w:rPr>
+              <w:t>7</w:t>
+            </w:r>
+            <w:r>
+              <w:rPr>
+                <w:noProof/>
+                <w:webHidden/>
+              </w:rPr>
+              <w:fldChar w:fldCharType="end"/>
+            </w:r>
+          </w:hyperlink>
+        </w:p>
+        <w:p>
+          <w:pPr>
+            <w:pStyle w:val="TDC2"/>
+            <w:tabs>
+              <w:tab w:val="right" w:leader="dot" w:pos="8494"/>
+            </w:tabs>
+            <w:rPr>
+              <w:rFonts w:eastAsiaTheme="minorEastAsia"/>
+              <w:noProof/>
+              <w:sz w:val="24"/>
+              <w:szCs w:val="24"/>
+              <w:lang w:eastAsia="es-AR"/>
+            </w:rPr>
+          </w:pPr>
+          <w:hyperlink w:anchor="_Toc235648174" w:history="1">
+            <w:r>
+              <w:rPr>
+                <w:rStyle w:val="Hipervnculo"/>
+                <w:noProof/>
+              </w:rPr>
+              <w:t>Previ</w:t>
+            </w:r>
+            <w:r>
+              <w:rPr>
+                <w:rStyle w:val="Hipervnculo"/>
+                <w:noProof/>
+              </w:rPr>
+              <w:t>o</w:t>
+            </w:r>
+            <w:r>
+              <w:rPr>
+                <w:rStyle w:val="Hipervnculo"/>
+                <w:noProof/>
+              </w:rPr>
+              <w:t xml:space="preserve"> a clase</w:t>
+            </w:r>
+            <w:r>
+              <w:rPr>
+                <w:noProof/>
+                <w:webHidden/>
+              </w:rPr>
+              <w:tab/>
+            </w:r>
+            <w:r>
+              <w:rPr>
+                <w:noProof/>
+                <w:webHidden/>
+              </w:rPr>
+              <w:fldChar w:fldCharType="begin"/>
+            </w:r>
+            <w:r>
+              <w:rPr>
+                <w:noProof/>
+                <w:webHidden/>
+              </w:rPr>
+              <w:instrText xml:space="preserve"> PAGEREF _Toc235648174 \h </w:instrText>
+            </w:r>
+            <w:r>
+              <w:rPr>
+                <w:noProof/>
+                <w:webHidden/>
+              </w:rPr>
+            </w:r>
+            <w:r>
+              <w:rPr>
+                <w:noProof/>
+                <w:webHidden/>
+              </w:rPr>
+              <w:fldChar w:fldCharType="separate"/>
+            </w:r>
+            <w:r>
+              <w:rPr>
+                <w:noProof/>
+                <w:webHidden/>
+              </w:rPr>
+              <w:t>7</w:t>
+            </w:r>
+            <w:r>
+              <w:rPr>
+                <w:noProof/>
+                <w:webHidden/>
+              </w:rPr>
+              <w:fldChar w:fldCharType="end"/>
+            </w:r>
+          </w:hyperlink>
+        </w:p>
+        <w:p>
           <w:r>
             <w:rPr>
               <w:b/>
@@ -240,7 +477,7 @@
       <w:pPr>
         <w:pStyle w:val="Ttulo1"/>
       </w:pPr>
-      <w:bookmarkStart w:id="0" w:name="_Toc233718567"/>
+      <w:bookmarkStart w:id="0" w:name="_Toc235648170"/>
       <w:r>
         <w:t>Clase 1</w:t>
       </w:r>
@@ -421,7 +658,11 @@
         <w:t>Es un interruptor electromagnético accionado a distancia, (se acciona por medio de una bobina). El campo magnético atrae un núcleo móvil y cierra los contactos de potencia. También tiene “contactos de control”.</w:t>
       </w:r>
       <w:r>
-        <w:t>Cuando se energiza su bobina, se cierran los 3 contactos y alimenta al motor.</w:t>
+        <w:t xml:space="preserve">Cuando se energiza su bobina, se </w:t>
+      </w:r>
+      <w:r>
+        <w:lastRenderedPageBreak/>
+        <w:t>cierran los 3 contactos y alimenta al motor.</w:t>
       </w:r>
       <w:r>
         <w:t xml:space="preserve"> Cuando la bobina deja de energizarse desaparece campo magnético y un resorte devuelve el núcleo a su posición inicial.</w:t>
@@ -435,7 +676,6 @@
         <w:rPr>
           <w:noProof/>
         </w:rPr>
-        <w:lastRenderedPageBreak/>
         <w:drawing>
           <wp:inline distT="0" distB="0" distL="0" distR="0" wp14:anchorId="2DFB5217" wp14:editId="740CBF92">
             <wp:extent cx="1286054" cy="704948"/>
@@ -1829,7 +2069,7 @@
       <w:pPr>
         <w:pStyle w:val="Ttulo2"/>
       </w:pPr>
-      <w:bookmarkStart w:id="1" w:name="_Toc233718568"/>
+      <w:bookmarkStart w:id="1" w:name="_Toc235648171"/>
       <w:r>
         <w:t>Simulación con CADe_SIMU</w:t>
       </w:r>
@@ -3341,26 +3581,534 @@
         <w:t>comunes son los DIN 35 mm, también lamados Top Hat Rail y Omega Rail. Normalmente para liberarlos se libera con una pestaña de destornillador.</w:t>
       </w:r>
     </w:p>
+    <w:p>
+      <w:pPr>
+        <w:pStyle w:val="Ttulo1"/>
+      </w:pPr>
+      <w:bookmarkStart w:id="2" w:name="_Toc235648172"/>
+      <w:r>
+        <w:t>Clase 2</w:t>
+      </w:r>
+      <w:bookmarkEnd w:id="2"/>
+    </w:p>
+    <w:p>
+      <w:r>
+        <w:t>En esta clase se conectan los equipamentos para lograr arranque directo según el diagrama visto en clase 1.</w:t>
+      </w:r>
+    </w:p>
+    <w:p>
+      <w:pPr>
+        <w:jc w:val="center"/>
+      </w:pPr>
+      <w:r>
+        <w:rPr>
+          <w:noProof/>
+        </w:rPr>
+        <w:drawing>
+          <wp:inline distT="0" distB="0" distL="0" distR="0" wp14:anchorId="1FDB46FA" wp14:editId="6CA97AE6">
+            <wp:extent cx="3327400" cy="2495550"/>
+            <wp:effectExtent l="0" t="0" r="6350" b="0"/>
+            <wp:docPr id="606133885" name="Imagen 17" descr="Imagen que contiene tabla, grande, agua, perro&#10;&#10;El contenido generado por IA puede ser incorrecto."/>
+            <wp:cNvGraphicFramePr>
+              <a:graphicFrameLocks xmlns:a="http://schemas.openxmlformats.org/drawingml/2006/main" noChangeAspect="1"/>
+            </wp:cNvGraphicFramePr>
+            <a:graphic xmlns:a="http://schemas.openxmlformats.org/drawingml/2006/main">
+              <a:graphicData uri="http://schemas.openxmlformats.org/drawingml/2006/picture">
+                <pic:pic xmlns:pic="http://schemas.openxmlformats.org/drawingml/2006/picture">
+                  <pic:nvPicPr>
+                    <pic:cNvPr id="606133885" name="Imagen 17" descr="Imagen que contiene tabla, grande, agua, perro&#10;&#10;El contenido generado por IA puede ser incorrecto."/>
+                    <pic:cNvPicPr>
+                      <a:picLocks noChangeAspect="1" noChangeArrowheads="1"/>
+                    </pic:cNvPicPr>
+                  </pic:nvPicPr>
+                  <pic:blipFill>
+                    <a:blip r:embed="rId34" cstate="print">
+                      <a:extLst>
+                        <a:ext uri="{28A0092B-C50C-407E-A947-70E740481C1C}">
+                          <a14:useLocalDpi xmlns:a14="http://schemas.microsoft.com/office/drawing/2010/main" val="0"/>
+                        </a:ext>
+                      </a:extLst>
+                    </a:blip>
+                    <a:srcRect/>
+                    <a:stretch>
+                      <a:fillRect/>
+                    </a:stretch>
+                  </pic:blipFill>
+                  <pic:spPr bwMode="auto">
+                    <a:xfrm>
+                      <a:off x="0" y="0"/>
+                      <a:ext cx="3330682" cy="2498012"/>
+                    </a:xfrm>
+                    <a:prstGeom prst="rect">
+                      <a:avLst/>
+                    </a:prstGeom>
+                    <a:noFill/>
+                    <a:ln>
+                      <a:noFill/>
+                    </a:ln>
+                  </pic:spPr>
+                </pic:pic>
+              </a:graphicData>
+            </a:graphic>
+          </wp:inline>
+        </w:drawing>
+      </w:r>
+    </w:p>
+    <w:p>
+      <w:pPr>
+        <w:pStyle w:val="Ttulo1"/>
+      </w:pPr>
+      <w:r>
+        <w:t xml:space="preserve">Clase </w:t>
+      </w:r>
+      <w:r>
+        <w:t>3</w:t>
+      </w:r>
+    </w:p>
+    <w:p>
+      <w:r>
+        <w:t>Se hace ejercicio de arranque directo e inversión de marcha.</w:t>
+      </w:r>
+    </w:p>
+    <w:p>
+      <w:r>
+        <w:drawing>
+          <wp:inline distT="0" distB="0" distL="0" distR="0" wp14:anchorId="45FA79F2" wp14:editId="654C9B92">
+            <wp:extent cx="5400040" cy="3188335"/>
+            <wp:effectExtent l="0" t="0" r="0" b="0"/>
+            <wp:docPr id="138860309" name="Imagen 1" descr="Diagrama&#10;&#10;El contenido generado por IA puede ser incorrecto."/>
+            <wp:cNvGraphicFramePr>
+              <a:graphicFrameLocks xmlns:a="http://schemas.openxmlformats.org/drawingml/2006/main" noChangeAspect="1"/>
+            </wp:cNvGraphicFramePr>
+            <a:graphic xmlns:a="http://schemas.openxmlformats.org/drawingml/2006/main">
+              <a:graphicData uri="http://schemas.openxmlformats.org/drawingml/2006/picture">
+                <pic:pic xmlns:pic="http://schemas.openxmlformats.org/drawingml/2006/picture">
+                  <pic:nvPicPr>
+                    <pic:cNvPr id="138860309" name="Imagen 1" descr="Diagrama&#10;&#10;El contenido generado por IA puede ser incorrecto."/>
+                    <pic:cNvPicPr/>
+                  </pic:nvPicPr>
+                  <pic:blipFill>
+                    <a:blip r:embed="rId35"/>
+                    <a:stretch>
+                      <a:fillRect/>
+                    </a:stretch>
+                  </pic:blipFill>
+                  <pic:spPr>
+                    <a:xfrm>
+                      <a:off x="0" y="0"/>
+                      <a:ext cx="5400040" cy="3188335"/>
+                    </a:xfrm>
+                    <a:prstGeom prst="rect">
+                      <a:avLst/>
+                    </a:prstGeom>
+                  </pic:spPr>
+                </pic:pic>
+              </a:graphicData>
+            </a:graphic>
+          </wp:inline>
+        </w:drawing>
+      </w:r>
+    </w:p>
+    <w:p>
+      <w:r>
+        <w:t xml:space="preserve">Se cuenta con este circuito, al momento de energizar el circuito el led testigo verde se mantiene encendido por contacto KM1. </w:t>
+      </w:r>
+    </w:p>
+    <w:p>
+      <w:r>
+        <w:lastRenderedPageBreak/>
+        <w:drawing>
+          <wp:inline distT="0" distB="0" distL="0" distR="0" wp14:anchorId="1CADA91D" wp14:editId="38D1C285">
+            <wp:extent cx="5400040" cy="3209925"/>
+            <wp:effectExtent l="0" t="0" r="0" b="9525"/>
+            <wp:docPr id="826617286" name="Imagen 1" descr="Diagrama&#10;&#10;El contenido generado por IA puede ser incorrecto."/>
+            <wp:cNvGraphicFramePr>
+              <a:graphicFrameLocks xmlns:a="http://schemas.openxmlformats.org/drawingml/2006/main" noChangeAspect="1"/>
+            </wp:cNvGraphicFramePr>
+            <a:graphic xmlns:a="http://schemas.openxmlformats.org/drawingml/2006/main">
+              <a:graphicData uri="http://schemas.openxmlformats.org/drawingml/2006/picture">
+                <pic:pic xmlns:pic="http://schemas.openxmlformats.org/drawingml/2006/picture">
+                  <pic:nvPicPr>
+                    <pic:cNvPr id="826617286" name="Imagen 1" descr="Diagrama&#10;&#10;El contenido generado por IA puede ser incorrecto."/>
+                    <pic:cNvPicPr/>
+                  </pic:nvPicPr>
+                  <pic:blipFill>
+                    <a:blip r:embed="rId36"/>
+                    <a:stretch>
+                      <a:fillRect/>
+                    </a:stretch>
+                  </pic:blipFill>
+                  <pic:spPr>
+                    <a:xfrm>
+                      <a:off x="0" y="0"/>
+                      <a:ext cx="5400040" cy="3209925"/>
+                    </a:xfrm>
+                    <a:prstGeom prst="rect">
+                      <a:avLst/>
+                    </a:prstGeom>
+                  </pic:spPr>
+                </pic:pic>
+              </a:graphicData>
+            </a:graphic>
+          </wp:inline>
+        </w:drawing>
+      </w:r>
+    </w:p>
+    <w:p>
+      <w:r>
+        <w:t>Se presiona el pulsador de marcha S2 para energizar bobina KM1 y cerrar contactor de linea del motor con marcha directa. El enclavamiento mantiene energizada bobina de KM1 por contacto KM1 NA</w:t>
+      </w:r>
+      <w:r>
+        <w:t xml:space="preserve"> y enciene led amarillo por contacto KM1.</w:t>
+      </w:r>
+    </w:p>
+    <w:p>
+      <w:r>
+        <w:drawing>
+          <wp:inline distT="0" distB="0" distL="0" distR="0" wp14:anchorId="63AB8A73" wp14:editId="765041FA">
+            <wp:extent cx="5400040" cy="3188335"/>
+            <wp:effectExtent l="0" t="0" r="0" b="0"/>
+            <wp:docPr id="1061811" name="Imagen 1" descr="Mapa de colores&#10;&#10;El contenido generado por IA puede ser incorrecto."/>
+            <wp:cNvGraphicFramePr>
+              <a:graphicFrameLocks xmlns:a="http://schemas.openxmlformats.org/drawingml/2006/main" noChangeAspect="1"/>
+            </wp:cNvGraphicFramePr>
+            <a:graphic xmlns:a="http://schemas.openxmlformats.org/drawingml/2006/main">
+              <a:graphicData uri="http://schemas.openxmlformats.org/drawingml/2006/picture">
+                <pic:pic xmlns:pic="http://schemas.openxmlformats.org/drawingml/2006/picture">
+                  <pic:nvPicPr>
+                    <pic:cNvPr id="1061811" name="Imagen 1" descr="Mapa de colores&#10;&#10;El contenido generado por IA puede ser incorrecto."/>
+                    <pic:cNvPicPr/>
+                  </pic:nvPicPr>
+                  <pic:blipFill>
+                    <a:blip r:embed="rId37"/>
+                    <a:stretch>
+                      <a:fillRect/>
+                    </a:stretch>
+                  </pic:blipFill>
+                  <pic:spPr>
+                    <a:xfrm>
+                      <a:off x="0" y="0"/>
+                      <a:ext cx="5400040" cy="3188335"/>
+                    </a:xfrm>
+                    <a:prstGeom prst="rect">
+                      <a:avLst/>
+                    </a:prstGeom>
+                  </pic:spPr>
+                </pic:pic>
+              </a:graphicData>
+            </a:graphic>
+          </wp:inline>
+        </w:drawing>
+      </w:r>
+    </w:p>
+    <w:p>
+      <w:r>
+        <w:t>Si queremos invertir la marcha, primero se debe pulsar S1 para detener la marcha y luego recien invertirla presionando el pulsador S3.</w:t>
+      </w:r>
+    </w:p>
+    <w:p>
+      <w:r>
+        <w:t>Al pulsar S3 se producirá enclavamiento por contacto KM2 y la bobina KM2 cerrará el contactor de línea que tiene invertida 2 de sus fases para cambiar el sentido de giro del motor:</w:t>
+      </w:r>
+    </w:p>
+    <w:p>
+      <w:r>
+        <w:rPr>
+          <w:noProof/>
+        </w:rPr>
+        <w:lastRenderedPageBreak/>
+        <mc:AlternateContent>
+          <mc:Choice Requires="wps">
+            <w:drawing>
+              <wp:anchor distT="0" distB="0" distL="114300" distR="114300" simplePos="0" relativeHeight="251691008" behindDoc="0" locked="0" layoutInCell="1" allowOverlap="1" wp14:anchorId="7562AD08" wp14:editId="75DBB50D">
+                <wp:simplePos x="0" y="0"/>
+                <wp:positionH relativeFrom="column">
+                  <wp:posOffset>2824962</wp:posOffset>
+                </wp:positionH>
+                <wp:positionV relativeFrom="paragraph">
+                  <wp:posOffset>2482926</wp:posOffset>
+                </wp:positionV>
+                <wp:extent cx="212141" cy="182880"/>
+                <wp:effectExtent l="0" t="19050" r="35560" b="45720"/>
+                <wp:wrapNone/>
+                <wp:docPr id="900657759" name="Flecha: a la derecha 18"/>
+                <wp:cNvGraphicFramePr/>
+                <a:graphic xmlns:a="http://schemas.openxmlformats.org/drawingml/2006/main">
+                  <a:graphicData uri="http://schemas.microsoft.com/office/word/2010/wordprocessingShape">
+                    <wps:wsp>
+                      <wps:cNvSpPr/>
+                      <wps:spPr>
+                        <a:xfrm>
+                          <a:off x="0" y="0"/>
+                          <a:ext cx="212141" cy="182880"/>
+                        </a:xfrm>
+                        <a:prstGeom prst="rightArrow">
+                          <a:avLst/>
+                        </a:prstGeom>
+                      </wps:spPr>
+                      <wps:style>
+                        <a:lnRef idx="2">
+                          <a:schemeClr val="accent1">
+                            <a:shade val="15000"/>
+                          </a:schemeClr>
+                        </a:lnRef>
+                        <a:fillRef idx="1">
+                          <a:schemeClr val="accent1"/>
+                        </a:fillRef>
+                        <a:effectRef idx="0">
+                          <a:schemeClr val="accent1"/>
+                        </a:effectRef>
+                        <a:fontRef idx="minor">
+                          <a:schemeClr val="lt1"/>
+                        </a:fontRef>
+                      </wps:style>
+                      <wps:bodyPr rot="0" spcFirstLastPara="0" vertOverflow="overflow" horzOverflow="overflow" vert="horz" wrap="square" lIns="91440" tIns="45720" rIns="91440" bIns="45720" numCol="1" spcCol="0" rtlCol="0" fromWordArt="0" anchor="ctr" anchorCtr="0" forceAA="0" compatLnSpc="1">
+                        <a:prstTxWarp prst="textNoShape">
+                          <a:avLst/>
+                        </a:prstTxWarp>
+                        <a:noAutofit/>
+                      </wps:bodyPr>
+                    </wps:wsp>
+                  </a:graphicData>
+                </a:graphic>
+              </wp:anchor>
+            </w:drawing>
+          </mc:Choice>
+          <mc:Fallback>
+            <w:pict>
+              <v:shapetype w14:anchorId="6F33288B" id="_x0000_t13" coordsize="21600,21600" o:spt="13" adj="16200,5400" path="m@0,l@0@1,0@1,0@2@0@2@0,21600,21600,10800xe">
+                <v:stroke joinstyle="miter"/>
+                <v:formulas>
+                  <v:f eqn="val #0"/>
+                  <v:f eqn="val #1"/>
+                  <v:f eqn="sum height 0 #1"/>
+                  <v:f eqn="sum 10800 0 #1"/>
+                  <v:f eqn="sum width 0 #0"/>
+                  <v:f eqn="prod @4 @3 10800"/>
+                  <v:f eqn="sum width 0 @5"/>
+                </v:formulas>
+                <v:path o:connecttype="custom" o:connectlocs="@0,0;0,10800;@0,21600;21600,10800" o:connectangles="270,180,90,0" textboxrect="0,@1,@6,@2"/>
+                <v:handles>
+                  <v:h position="#0,#1" xrange="0,21600" yrange="0,10800"/>
+                </v:handles>
+              </v:shapetype>
+              <v:shape id="Flecha: a la derecha 18" o:spid="_x0000_s1026" type="#_x0000_t13" style="position:absolute;margin-left:222.45pt;margin-top:195.5pt;width:16.7pt;height:14.4pt;z-index:251691008;visibility:visible;mso-wrap-style:square;mso-wrap-distance-left:9pt;mso-wrap-distance-top:0;mso-wrap-distance-right:9pt;mso-wrap-distance-bottom:0;mso-position-horizontal:absolute;mso-position-horizontal-relative:text;mso-position-vertical:absolute;mso-position-vertical-relative:text;v-text-anchor:middle" o:gfxdata="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" adj="12290" fillcolor="#156082 [3204]" strokecolor="#030e13 [484]" strokeweight="1pt"/>
+            </w:pict>
+          </mc:Fallback>
+        </mc:AlternateContent>
+      </w:r>
+      <w:r>
+        <w:rPr>
+          <w:noProof/>
+        </w:rPr>
+        <mc:AlternateContent>
+          <mc:Choice Requires="wps">
+            <w:drawing>
+              <wp:anchor distT="0" distB="0" distL="114300" distR="114300" simplePos="0" relativeHeight="251688960" behindDoc="0" locked="0" layoutInCell="1" allowOverlap="1" wp14:anchorId="1430F03A" wp14:editId="6B5F0C2B">
+                <wp:simplePos x="0" y="0"/>
+                <wp:positionH relativeFrom="column">
+                  <wp:posOffset>199898</wp:posOffset>
+                </wp:positionH>
+                <wp:positionV relativeFrom="paragraph">
+                  <wp:posOffset>2289099</wp:posOffset>
+                </wp:positionV>
+                <wp:extent cx="212141" cy="182880"/>
+                <wp:effectExtent l="0" t="19050" r="35560" b="45720"/>
+                <wp:wrapNone/>
+                <wp:docPr id="1405868021" name="Flecha: a la derecha 18"/>
+                <wp:cNvGraphicFramePr/>
+                <a:graphic xmlns:a="http://schemas.openxmlformats.org/drawingml/2006/main">
+                  <a:graphicData uri="http://schemas.microsoft.com/office/word/2010/wordprocessingShape">
+                    <wps:wsp>
+                      <wps:cNvSpPr/>
+                      <wps:spPr>
+                        <a:xfrm>
+                          <a:off x="0" y="0"/>
+                          <a:ext cx="212141" cy="182880"/>
+                        </a:xfrm>
+                        <a:prstGeom prst="rightArrow">
+                          <a:avLst/>
+                        </a:prstGeom>
+                      </wps:spPr>
+                      <wps:style>
+                        <a:lnRef idx="2">
+                          <a:schemeClr val="accent1">
+                            <a:shade val="15000"/>
+                          </a:schemeClr>
+                        </a:lnRef>
+                        <a:fillRef idx="1">
+                          <a:schemeClr val="accent1"/>
+                        </a:fillRef>
+                        <a:effectRef idx="0">
+                          <a:schemeClr val="accent1"/>
+                        </a:effectRef>
+                        <a:fontRef idx="minor">
+                          <a:schemeClr val="lt1"/>
+                        </a:fontRef>
+                      </wps:style>
+                      <wps:bodyPr rot="0" spcFirstLastPara="0" vertOverflow="overflow" horzOverflow="overflow" vert="horz" wrap="square" lIns="91440" tIns="45720" rIns="91440" bIns="45720" numCol="1" spcCol="0" rtlCol="0" fromWordArt="0" anchor="ctr" anchorCtr="0" forceAA="0" compatLnSpc="1">
+                        <a:prstTxWarp prst="textNoShape">
+                          <a:avLst/>
+                        </a:prstTxWarp>
+                        <a:noAutofit/>
+                      </wps:bodyPr>
+                    </wps:wsp>
+                  </a:graphicData>
+                </a:graphic>
+              </wp:anchor>
+            </w:drawing>
+          </mc:Choice>
+          <mc:Fallback>
+            <w:pict>
+              <v:shape w14:anchorId="571C75B7" id="Flecha: a la derecha 18" o:spid="_x0000_s1026" type="#_x0000_t13" style="position:absolute;margin-left:15.75pt;margin-top:180.25pt;width:16.7pt;height:14.4pt;z-index:251688960;visibility:visible;mso-wrap-style:square;mso-wrap-distance-left:9pt;mso-wrap-distance-top:0;mso-wrap-distance-right:9pt;mso-wrap-distance-bottom:0;mso-position-horizontal:absolute;mso-position-horizontal-relative:text;mso-position-vertical:absolute;mso-position-vertical-relative:text;v-text-anchor:middle" o:gfxdata="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" adj="12290" fillcolor="#156082 [3204]" strokecolor="#030e13 [484]" strokeweight="1pt"/>
+            </w:pict>
+          </mc:Fallback>
+        </mc:AlternateContent>
+      </w:r>
+      <w:r>
+        <w:rPr>
+          <w:noProof/>
+        </w:rPr>
+        <mc:AlternateContent>
+          <mc:Choice Requires="wps">
+            <w:drawing>
+              <wp:anchor distT="0" distB="0" distL="114300" distR="114300" simplePos="0" relativeHeight="251687936" behindDoc="0" locked="0" layoutInCell="1" allowOverlap="1" wp14:anchorId="433201FF" wp14:editId="2A307279">
+                <wp:simplePos x="0" y="0"/>
+                <wp:positionH relativeFrom="column">
+                  <wp:posOffset>1663065</wp:posOffset>
+                </wp:positionH>
+                <wp:positionV relativeFrom="paragraph">
+                  <wp:posOffset>1726362</wp:posOffset>
+                </wp:positionV>
+                <wp:extent cx="197510" cy="175565"/>
+                <wp:effectExtent l="19050" t="19050" r="12065" b="34290"/>
+                <wp:wrapNone/>
+                <wp:docPr id="911729743" name="Flecha: hacia la izquierda 17"/>
+                <wp:cNvGraphicFramePr/>
+                <a:graphic xmlns:a="http://schemas.openxmlformats.org/drawingml/2006/main">
+                  <a:graphicData uri="http://schemas.microsoft.com/office/word/2010/wordprocessingShape">
+                    <wps:wsp>
+                      <wps:cNvSpPr/>
+                      <wps:spPr>
+                        <a:xfrm>
+                          <a:off x="0" y="0"/>
+                          <a:ext cx="197510" cy="175565"/>
+                        </a:xfrm>
+                        <a:prstGeom prst="leftArrow">
+                          <a:avLst/>
+                        </a:prstGeom>
+                      </wps:spPr>
+                      <wps:style>
+                        <a:lnRef idx="2">
+                          <a:schemeClr val="accent1">
+                            <a:shade val="15000"/>
+                          </a:schemeClr>
+                        </a:lnRef>
+                        <a:fillRef idx="1">
+                          <a:schemeClr val="accent1"/>
+                        </a:fillRef>
+                        <a:effectRef idx="0">
+                          <a:schemeClr val="accent1"/>
+                        </a:effectRef>
+                        <a:fontRef idx="minor">
+                          <a:schemeClr val="lt1"/>
+                        </a:fontRef>
+                      </wps:style>
+                      <wps:bodyPr rot="0" spcFirstLastPara="0" vertOverflow="overflow" horzOverflow="overflow" vert="horz" wrap="square" lIns="91440" tIns="45720" rIns="91440" bIns="45720" numCol="1" spcCol="0" rtlCol="0" fromWordArt="0" anchor="ctr" anchorCtr="0" forceAA="0" compatLnSpc="1">
+                        <a:prstTxWarp prst="textNoShape">
+                          <a:avLst/>
+                        </a:prstTxWarp>
+                        <a:noAutofit/>
+                      </wps:bodyPr>
+                    </wps:wsp>
+                  </a:graphicData>
+                </a:graphic>
+              </wp:anchor>
+            </w:drawing>
+          </mc:Choice>
+          <mc:Fallback>
+            <w:pict>
+              <v:shapetype w14:anchorId="1B8791C7" id="_x0000_t66" coordsize="21600,21600" o:spt="66" adj="5400,5400" path="m@0,l@0@1,21600@1,21600@2@0@2@0,21600,,10800xe">
+                <v:stroke joinstyle="miter"/>
+                <v:formulas>
+                  <v:f eqn="val #0"/>
+                  <v:f eqn="val #1"/>
+                  <v:f eqn="sum 21600 0 #1"/>
+                  <v:f eqn="prod #0 #1 10800"/>
+                  <v:f eqn="sum #0 0 @3"/>
+                </v:formulas>
+                <v:path o:connecttype="custom" o:connectlocs="@0,0;0,10800;@0,21600;21600,10800" o:connectangles="270,180,90,0" textboxrect="@4,@1,21600,@2"/>
+                <v:handles>
+                  <v:h position="#0,#1" xrange="0,21600" yrange="0,10800"/>
+                </v:handles>
+              </v:shapetype>
+              <v:shape id="Flecha: hacia la izquierda 17" o:spid="_x0000_s1026" type="#_x0000_t66" style="position:absolute;margin-left:130.95pt;margin-top:135.95pt;width:15.55pt;height:13.8pt;z-index:251687936;visibility:visible;mso-wrap-style:square;mso-wrap-distance-left:9pt;mso-wrap-distance-top:0;mso-wrap-distance-right:9pt;mso-wrap-distance-bottom:0;mso-position-horizontal:absolute;mso-position-horizontal-relative:text;mso-position-vertical:absolute;mso-position-vertical-relative:text;v-text-anchor:middle" o:gfxdata="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" adj="9600" fillcolor="#156082 [3204]" strokecolor="#030e13 [484]" strokeweight="1pt"/>
+            </w:pict>
+          </mc:Fallback>
+        </mc:AlternateContent>
+      </w:r>
+      <w:r>
+        <w:drawing>
+          <wp:inline distT="0" distB="0" distL="0" distR="0" wp14:anchorId="614F57C5" wp14:editId="4FF83E89">
+            <wp:extent cx="5400040" cy="3135630"/>
+            <wp:effectExtent l="0" t="0" r="0" b="7620"/>
+            <wp:docPr id="530004636" name="Imagen 1" descr="Diagrama&#10;&#10;El contenido generado por IA puede ser incorrecto."/>
+            <wp:cNvGraphicFramePr>
+              <a:graphicFrameLocks xmlns:a="http://schemas.openxmlformats.org/drawingml/2006/main" noChangeAspect="1"/>
+            </wp:cNvGraphicFramePr>
+            <a:graphic xmlns:a="http://schemas.openxmlformats.org/drawingml/2006/main">
+              <a:graphicData uri="http://schemas.openxmlformats.org/drawingml/2006/picture">
+                <pic:pic xmlns:pic="http://schemas.openxmlformats.org/drawingml/2006/picture">
+                  <pic:nvPicPr>
+                    <pic:cNvPr id="530004636" name="Imagen 1" descr="Diagrama&#10;&#10;El contenido generado por IA puede ser incorrecto."/>
+                    <pic:cNvPicPr/>
+                  </pic:nvPicPr>
+                  <pic:blipFill>
+                    <a:blip r:embed="rId38"/>
+                    <a:stretch>
+                      <a:fillRect/>
+                    </a:stretch>
+                  </pic:blipFill>
+                  <pic:spPr>
+                    <a:xfrm>
+                      <a:off x="0" y="0"/>
+                      <a:ext cx="5400040" cy="3135630"/>
+                    </a:xfrm>
+                    <a:prstGeom prst="rect">
+                      <a:avLst/>
+                    </a:prstGeom>
+                  </pic:spPr>
+                </pic:pic>
+              </a:graphicData>
+            </a:graphic>
+          </wp:inline>
+        </w:drawing>
+      </w:r>
+    </w:p>
     <w:p/>
     <w:p/>
     <w:p>
       <w:pPr>
         <w:pStyle w:val="Ttulo1"/>
       </w:pPr>
+      <w:bookmarkStart w:id="3" w:name="_Toc235648173"/>
       <w:r>
         <w:t xml:space="preserve">Clase </w:t>
       </w:r>
-      <w:r>
-        <w:t>3</w:t>
+      <w:bookmarkEnd w:id="3"/>
+      <w:r>
+        <w:t>4</w:t>
       </w:r>
     </w:p>
     <w:p>
       <w:pPr>
         <w:pStyle w:val="Ttulo2"/>
       </w:pPr>
+      <w:bookmarkStart w:id="4" w:name="_Toc235648174"/>
       <w:r>
         <w:t>Previo a clase</w:t>
       </w:r>
+      <w:bookmarkEnd w:id="4"/>
     </w:p>
     <w:p>
       <w:r>
@@ -3368,10 +4116,16 @@
       </w:r>
     </w:p>
     <w:p>
-      <w:r>
+      <w:pPr>
+        <w:jc w:val="center"/>
+      </w:pPr>
+      <w:r>
+        <w:rPr>
+          <w:noProof/>
+        </w:rPr>
         <w:drawing>
-          <wp:inline distT="0" distB="0" distL="0" distR="0" wp14:anchorId="26411E7C" wp14:editId="748B9C78">
-            <wp:extent cx="5400040" cy="3162300"/>
+          <wp:inline distT="0" distB="0" distL="0" distR="0" wp14:anchorId="26411E7C" wp14:editId="4D8B92E7">
+            <wp:extent cx="3877056" cy="2270430"/>
             <wp:effectExtent l="0" t="0" r="0" b="0"/>
             <wp:docPr id="2025903516" name="Imagen 1" descr="Diagrama&#10;&#10;El contenido generado por IA puede ser incorrecto."/>
             <wp:cNvGraphicFramePr>
@@ -3385,7 +4139,7 @@
                     <pic:cNvPicPr/>
                   </pic:nvPicPr>
                   <pic:blipFill>
-                    <a:blip r:embed="rId34"/>
+                    <a:blip r:embed="rId39"/>
                     <a:stretch>
                       <a:fillRect/>
                     </a:stretch>
@@ -3393,7 +4147,7 @@
                   <pic:spPr>
                     <a:xfrm>
                       <a:off x="0" y="0"/>
-                      <a:ext cx="5400040" cy="3162300"/>
+                      <a:ext cx="3885180" cy="2275188"/>
                     </a:xfrm>
                     <a:prstGeom prst="rect">
                       <a:avLst/>
@@ -3412,11 +4166,18 @@
       </w:r>
     </w:p>
     <w:p>
-      <w:r>
+      <w:pPr>
+        <w:jc w:val="center"/>
+      </w:pPr>
+      <w:r>
+        <w:rPr>
+          <w:noProof/>
+        </w:rPr>
+        <w:lastRenderedPageBreak/>
         <w:drawing>
-          <wp:inline distT="0" distB="0" distL="0" distR="0" wp14:anchorId="18DA9A2B" wp14:editId="774966FF">
-            <wp:extent cx="5400040" cy="2385695"/>
-            <wp:effectExtent l="0" t="0" r="0" b="0"/>
+          <wp:inline distT="0" distB="0" distL="0" distR="0" wp14:anchorId="18DA9A2B" wp14:editId="2C37A367">
+            <wp:extent cx="4081881" cy="1803343"/>
+            <wp:effectExtent l="0" t="0" r="0" b="6985"/>
             <wp:docPr id="2062136051" name="Imagen 1" descr="Diagrama&#10;&#10;El contenido generado por IA puede ser incorrecto."/>
             <wp:cNvGraphicFramePr>
               <a:graphicFrameLocks xmlns:a="http://schemas.openxmlformats.org/drawingml/2006/main" noChangeAspect="1"/>
@@ -3429,7 +4190,7 @@
                     <pic:cNvPicPr/>
                   </pic:nvPicPr>
                   <pic:blipFill>
-                    <a:blip r:embed="rId35"/>
+                    <a:blip r:embed="rId40"/>
                     <a:stretch>
                       <a:fillRect/>
                     </a:stretch>
@@ -3437,7 +4198,7 @@
                   <pic:spPr>
                     <a:xfrm>
                       <a:off x="0" y="0"/>
-                      <a:ext cx="5400040" cy="2385695"/>
+                      <a:ext cx="4094941" cy="1809113"/>
                     </a:xfrm>
                     <a:prstGeom prst="rect">
                       <a:avLst/>
@@ -3452,17 +4213,22 @@
     </w:p>
     <w:p>
       <w:r>
-        <w:lastRenderedPageBreak/>
         <w:t>Es especialmente útil en aplicaciones industriales donde se requiere un alto torque de arranque.</w:t>
       </w:r>
     </w:p>
     <w:p>
-      <w:r>
+      <w:pPr>
+        <w:jc w:val="center"/>
+      </w:pPr>
+      <w:r>
+        <w:rPr>
+          <w:noProof/>
+        </w:rPr>
         <w:drawing>
-          <wp:inline distT="0" distB="0" distL="0" distR="0" wp14:anchorId="2F0ADB86" wp14:editId="520B60C6">
-            <wp:extent cx="5400040" cy="2985135"/>
-            <wp:effectExtent l="0" t="0" r="0" b="5715"/>
-            <wp:docPr id="1613894193" name="Imagen 1" descr="Imagen de la pantalla de un celular con letras&#10;&#10;El contenido generado por IA puede ser incorrecto."/>
+          <wp:inline distT="0" distB="0" distL="0" distR="0" wp14:anchorId="550CCDCB" wp14:editId="09101714">
+            <wp:extent cx="3263900" cy="2447925"/>
+            <wp:effectExtent l="0" t="0" r="0" b="9525"/>
+            <wp:docPr id="293596466" name="Imagen 19" descr="Imagen que contiene barco, cama&#10;&#10;El contenido generado por IA puede ser incorrecto."/>
             <wp:cNvGraphicFramePr>
               <a:graphicFrameLocks xmlns:a="http://schemas.openxmlformats.org/drawingml/2006/main" noChangeAspect="1"/>
             </wp:cNvGraphicFramePr>
@@ -3470,11 +4236,242 @@
               <a:graphicData uri="http://schemas.openxmlformats.org/drawingml/2006/picture">
                 <pic:pic xmlns:pic="http://schemas.openxmlformats.org/drawingml/2006/picture">
                   <pic:nvPicPr>
-                    <pic:cNvPr id="1613894193" name="Imagen 1" descr="Imagen de la pantalla de un celular con letras&#10;&#10;El contenido generado por IA puede ser incorrecto."/>
+                    <pic:cNvPr id="293596466" name="Imagen 19" descr="Imagen que contiene barco, cama&#10;&#10;El contenido generado por IA puede ser incorrecto."/>
+                    <pic:cNvPicPr>
+                      <a:picLocks noChangeAspect="1" noChangeArrowheads="1"/>
+                    </pic:cNvPicPr>
+                  </pic:nvPicPr>
+                  <pic:blipFill>
+                    <a:blip r:embed="rId41" cstate="print">
+                      <a:extLst>
+                        <a:ext uri="{28A0092B-C50C-407E-A947-70E740481C1C}">
+                          <a14:useLocalDpi xmlns:a14="http://schemas.microsoft.com/office/drawing/2010/main" val="0"/>
+                        </a:ext>
+                      </a:extLst>
+                    </a:blip>
+                    <a:srcRect/>
+                    <a:stretch>
+                      <a:fillRect/>
+                    </a:stretch>
+                  </pic:blipFill>
+                  <pic:spPr bwMode="auto">
+                    <a:xfrm>
+                      <a:off x="0" y="0"/>
+                      <a:ext cx="3270163" cy="2452622"/>
+                    </a:xfrm>
+                    <a:prstGeom prst="rect">
+                      <a:avLst/>
+                    </a:prstGeom>
+                    <a:noFill/>
+                    <a:ln>
+                      <a:noFill/>
+                    </a:ln>
+                  </pic:spPr>
+                </pic:pic>
+              </a:graphicData>
+            </a:graphic>
+          </wp:inline>
+        </w:drawing>
+      </w:r>
+    </w:p>
+    <w:p>
+      <w:pPr>
+        <w:jc w:val="center"/>
+      </w:pPr>
+      <w:r>
+        <w:rPr>
+          <w:noProof/>
+        </w:rPr>
+        <w:drawing>
+          <wp:inline distT="0" distB="0" distL="0" distR="0" wp14:anchorId="69B6100E" wp14:editId="05677CBF">
+            <wp:extent cx="1850746" cy="1388059"/>
+            <wp:effectExtent l="0" t="0" r="0" b="3175"/>
+            <wp:docPr id="1079199102" name="Imagen 20" descr="Imagen que contiene Interfaz de usuario gráfica&#10;&#10;El contenido generado por IA puede ser incorrecto."/>
+            <wp:cNvGraphicFramePr>
+              <a:graphicFrameLocks xmlns:a="http://schemas.openxmlformats.org/drawingml/2006/main" noChangeAspect="1"/>
+            </wp:cNvGraphicFramePr>
+            <a:graphic xmlns:a="http://schemas.openxmlformats.org/drawingml/2006/main">
+              <a:graphicData uri="http://schemas.openxmlformats.org/drawingml/2006/picture">
+                <pic:pic xmlns:pic="http://schemas.openxmlformats.org/drawingml/2006/picture">
+                  <pic:nvPicPr>
+                    <pic:cNvPr id="1079199102" name="Imagen 20" descr="Imagen que contiene Interfaz de usuario gráfica&#10;&#10;El contenido generado por IA puede ser incorrecto."/>
+                    <pic:cNvPicPr>
+                      <a:picLocks noChangeAspect="1" noChangeArrowheads="1"/>
+                    </pic:cNvPicPr>
+                  </pic:nvPicPr>
+                  <pic:blipFill>
+                    <a:blip r:embed="rId42" cstate="print">
+                      <a:extLst>
+                        <a:ext uri="{28A0092B-C50C-407E-A947-70E740481C1C}">
+                          <a14:useLocalDpi xmlns:a14="http://schemas.microsoft.com/office/drawing/2010/main" val="0"/>
+                        </a:ext>
+                      </a:extLst>
+                    </a:blip>
+                    <a:srcRect/>
+                    <a:stretch>
+                      <a:fillRect/>
+                    </a:stretch>
+                  </pic:blipFill>
+                  <pic:spPr bwMode="auto">
+                    <a:xfrm>
+                      <a:off x="0" y="0"/>
+                      <a:ext cx="1860042" cy="1395031"/>
+                    </a:xfrm>
+                    <a:prstGeom prst="rect">
+                      <a:avLst/>
+                    </a:prstGeom>
+                    <a:noFill/>
+                    <a:ln>
+                      <a:noFill/>
+                    </a:ln>
+                  </pic:spPr>
+                </pic:pic>
+              </a:graphicData>
+            </a:graphic>
+          </wp:inline>
+        </w:drawing>
+      </w:r>
+      <w:r>
+        <w:t xml:space="preserve"> </w:t>
+      </w:r>
+      <w:r>
+        <w:rPr>
+          <w:noProof/>
+        </w:rPr>
+        <w:drawing>
+          <wp:inline distT="0" distB="0" distL="0" distR="0" wp14:anchorId="1F1414ED" wp14:editId="0427C970">
+            <wp:extent cx="2058009" cy="1543507"/>
+            <wp:effectExtent l="0" t="0" r="0" b="0"/>
+            <wp:docPr id="1684056459" name="Imagen 22" descr="Imagen que contiene circuito, motor&#10;&#10;El contenido generado por IA puede ser incorrecto."/>
+            <wp:cNvGraphicFramePr>
+              <a:graphicFrameLocks xmlns:a="http://schemas.openxmlformats.org/drawingml/2006/main" noChangeAspect="1"/>
+            </wp:cNvGraphicFramePr>
+            <a:graphic xmlns:a="http://schemas.openxmlformats.org/drawingml/2006/main">
+              <a:graphicData uri="http://schemas.openxmlformats.org/drawingml/2006/picture">
+                <pic:pic xmlns:pic="http://schemas.openxmlformats.org/drawingml/2006/picture">
+                  <pic:nvPicPr>
+                    <pic:cNvPr id="1684056459" name="Imagen 22" descr="Imagen que contiene circuito, motor&#10;&#10;El contenido generado por IA puede ser incorrecto."/>
+                    <pic:cNvPicPr>
+                      <a:picLocks noChangeAspect="1" noChangeArrowheads="1"/>
+                    </pic:cNvPicPr>
+                  </pic:nvPicPr>
+                  <pic:blipFill>
+                    <a:blip r:embed="rId43" cstate="print">
+                      <a:extLst>
+                        <a:ext uri="{28A0092B-C50C-407E-A947-70E740481C1C}">
+                          <a14:useLocalDpi xmlns:a14="http://schemas.microsoft.com/office/drawing/2010/main" val="0"/>
+                        </a:ext>
+                      </a:extLst>
+                    </a:blip>
+                    <a:srcRect/>
+                    <a:stretch>
+                      <a:fillRect/>
+                    </a:stretch>
+                  </pic:blipFill>
+                  <pic:spPr bwMode="auto">
+                    <a:xfrm>
+                      <a:off x="0" y="0"/>
+                      <a:ext cx="2071505" cy="1553629"/>
+                    </a:xfrm>
+                    <a:prstGeom prst="rect">
+                      <a:avLst/>
+                    </a:prstGeom>
+                    <a:noFill/>
+                    <a:ln>
+                      <a:noFill/>
+                    </a:ln>
+                  </pic:spPr>
+                </pic:pic>
+              </a:graphicData>
+            </a:graphic>
+          </wp:inline>
+        </w:drawing>
+      </w:r>
+    </w:p>
+    <w:p>
+      <w:pPr>
+        <w:jc w:val="center"/>
+      </w:pPr>
+      <w:r>
+        <w:rPr>
+          <w:noProof/>
+        </w:rPr>
+        <w:drawing>
+          <wp:inline distT="0" distB="0" distL="0" distR="0" wp14:anchorId="70ACCFA8" wp14:editId="12669326">
+            <wp:extent cx="1912331" cy="1434248"/>
+            <wp:effectExtent l="0" t="8572" r="3492" b="3493"/>
+            <wp:docPr id="848305302" name="Imagen 21" descr="Imagen que contiene edificio, puerta, cubierto, refrigerador&#10;&#10;El contenido generado por IA puede ser incorrecto."/>
+            <wp:cNvGraphicFramePr>
+              <a:graphicFrameLocks xmlns:a="http://schemas.openxmlformats.org/drawingml/2006/main" noChangeAspect="1"/>
+            </wp:cNvGraphicFramePr>
+            <a:graphic xmlns:a="http://schemas.openxmlformats.org/drawingml/2006/main">
+              <a:graphicData uri="http://schemas.openxmlformats.org/drawingml/2006/picture">
+                <pic:pic xmlns:pic="http://schemas.openxmlformats.org/drawingml/2006/picture">
+                  <pic:nvPicPr>
+                    <pic:cNvPr id="848305302" name="Imagen 21" descr="Imagen que contiene edificio, puerta, cubierto, refrigerador&#10;&#10;El contenido generado por IA puede ser incorrecto."/>
+                    <pic:cNvPicPr>
+                      <a:picLocks noChangeAspect="1" noChangeArrowheads="1"/>
+                    </pic:cNvPicPr>
+                  </pic:nvPicPr>
+                  <pic:blipFill>
+                    <a:blip r:embed="rId44" cstate="print">
+                      <a:extLst>
+                        <a:ext uri="{28A0092B-C50C-407E-A947-70E740481C1C}">
+                          <a14:useLocalDpi xmlns:a14="http://schemas.microsoft.com/office/drawing/2010/main" val="0"/>
+                        </a:ext>
+                      </a:extLst>
+                    </a:blip>
+                    <a:srcRect/>
+                    <a:stretch>
+                      <a:fillRect/>
+                    </a:stretch>
+                  </pic:blipFill>
+                  <pic:spPr bwMode="auto">
+                    <a:xfrm rot="5400000">
+                      <a:off x="0" y="0"/>
+                      <a:ext cx="1921331" cy="1440998"/>
+                    </a:xfrm>
+                    <a:prstGeom prst="rect">
+                      <a:avLst/>
+                    </a:prstGeom>
+                    <a:noFill/>
+                    <a:ln>
+                      <a:noFill/>
+                    </a:ln>
+                  </pic:spPr>
+                </pic:pic>
+              </a:graphicData>
+            </a:graphic>
+          </wp:inline>
+        </w:drawing>
+      </w:r>
+    </w:p>
+    <w:p>
+      <w:r>
+        <w:lastRenderedPageBreak/>
+        <w:t>El siguiente es el esquema del arranque estrella-triangulo.</w:t>
+      </w:r>
+      <w:r>
+        <w:br/>
+      </w:r>
+      <w:r>
+        <w:drawing>
+          <wp:inline distT="0" distB="0" distL="0" distR="0" wp14:anchorId="33240E8E" wp14:editId="094F27B2">
+            <wp:extent cx="5400040" cy="3096260"/>
+            <wp:effectExtent l="0" t="0" r="0" b="8890"/>
+            <wp:docPr id="270069539" name="Imagen 1" descr="Diagrama&#10;&#10;El contenido generado por IA puede ser incorrecto."/>
+            <wp:cNvGraphicFramePr>
+              <a:graphicFrameLocks xmlns:a="http://schemas.openxmlformats.org/drawingml/2006/main" noChangeAspect="1"/>
+            </wp:cNvGraphicFramePr>
+            <a:graphic xmlns:a="http://schemas.openxmlformats.org/drawingml/2006/main">
+              <a:graphicData uri="http://schemas.openxmlformats.org/drawingml/2006/picture">
+                <pic:pic xmlns:pic="http://schemas.openxmlformats.org/drawingml/2006/picture">
+                  <pic:nvPicPr>
+                    <pic:cNvPr id="270069539" name="Imagen 1" descr="Diagrama&#10;&#10;El contenido generado por IA puede ser incorrecto."/>
                     <pic:cNvPicPr/>
                   </pic:nvPicPr>
                   <pic:blipFill>
-                    <a:blip r:embed="rId36"/>
+                    <a:blip r:embed="rId45"/>
                     <a:stretch>
                       <a:fillRect/>
                     </a:stretch>
@@ -3482,7 +4479,7 @@
                   <pic:spPr>
                     <a:xfrm>
                       <a:off x="0" y="0"/>
-                      <a:ext cx="5400040" cy="2985135"/>
+                      <a:ext cx="5400040" cy="3096260"/>
                     </a:xfrm>
                     <a:prstGeom prst="rect">
                       <a:avLst/>
@@ -3494,6 +4491,148 @@
           </wp:inline>
         </w:drawing>
       </w:r>
+    </w:p>
+    <w:p>
+      <w:r>
+        <w:t>Al cerrar el automático/proteccion contra cortocircuito, inicialmente no se energiza nada:</w:t>
+      </w:r>
+    </w:p>
+    <w:p>
+      <w:r>
+        <w:drawing>
+          <wp:inline distT="0" distB="0" distL="0" distR="0" wp14:anchorId="7A3CAF05" wp14:editId="731E42E9">
+            <wp:extent cx="5400040" cy="2977515"/>
+            <wp:effectExtent l="0" t="0" r="0" b="0"/>
+            <wp:docPr id="1034180693" name="Imagen 1" descr="Diagrama&#10;&#10;El contenido generado por IA puede ser incorrecto."/>
+            <wp:cNvGraphicFramePr>
+              <a:graphicFrameLocks xmlns:a="http://schemas.openxmlformats.org/drawingml/2006/main" noChangeAspect="1"/>
+            </wp:cNvGraphicFramePr>
+            <a:graphic xmlns:a="http://schemas.openxmlformats.org/drawingml/2006/main">
+              <a:graphicData uri="http://schemas.openxmlformats.org/drawingml/2006/picture">
+                <pic:pic xmlns:pic="http://schemas.openxmlformats.org/drawingml/2006/picture">
+                  <pic:nvPicPr>
+                    <pic:cNvPr id="1034180693" name="Imagen 1" descr="Diagrama&#10;&#10;El contenido generado por IA puede ser incorrecto."/>
+                    <pic:cNvPicPr/>
+                  </pic:nvPicPr>
+                  <pic:blipFill>
+                    <a:blip r:embed="rId46"/>
+                    <a:stretch>
+                      <a:fillRect/>
+                    </a:stretch>
+                  </pic:blipFill>
+                  <pic:spPr>
+                    <a:xfrm>
+                      <a:off x="0" y="0"/>
+                      <a:ext cx="5400040" cy="2977515"/>
+                    </a:xfrm>
+                    <a:prstGeom prst="rect">
+                      <a:avLst/>
+                    </a:prstGeom>
+                  </pic:spPr>
+                </pic:pic>
+              </a:graphicData>
+            </a:graphic>
+          </wp:inline>
+        </w:drawing>
+      </w:r>
+    </w:p>
+    <w:p>
+      <w:r>
+        <w:t>Al presionar el pulsador NA de marcha, se energizará bobina KM3 y se produce enclavamiento de esa rama entre nodo2 y nodo3. El temporizador comenzará contar hasta 8 segundos y activará los contactos T1. También al energizarse la bobina KM3 se cierra el contacto en la 2da rama del nodo1 y se energiza la bobina KM1 que hace enclavamiento de su propia rama.</w:t>
+      </w:r>
+    </w:p>
+    <w:p>
+      <w:r>
+        <w:lastRenderedPageBreak/>
+        <w:drawing>
+          <wp:inline distT="0" distB="0" distL="0" distR="0" wp14:anchorId="4D0596D4" wp14:editId="261DC5C6">
+            <wp:extent cx="5400040" cy="2945765"/>
+            <wp:effectExtent l="0" t="0" r="0" b="6985"/>
+            <wp:docPr id="448074931" name="Imagen 1" descr="Diagrama&#10;&#10;El contenido generado por IA puede ser incorrecto."/>
+            <wp:cNvGraphicFramePr>
+              <a:graphicFrameLocks xmlns:a="http://schemas.openxmlformats.org/drawingml/2006/main" noChangeAspect="1"/>
+            </wp:cNvGraphicFramePr>
+            <a:graphic xmlns:a="http://schemas.openxmlformats.org/drawingml/2006/main">
+              <a:graphicData uri="http://schemas.openxmlformats.org/drawingml/2006/picture">
+                <pic:pic xmlns:pic="http://schemas.openxmlformats.org/drawingml/2006/picture">
+                  <pic:nvPicPr>
+                    <pic:cNvPr id="448074931" name="Imagen 1" descr="Diagrama&#10;&#10;El contenido generado por IA puede ser incorrecto."/>
+                    <pic:cNvPicPr/>
+                  </pic:nvPicPr>
+                  <pic:blipFill>
+                    <a:blip r:embed="rId47"/>
+                    <a:stretch>
+                      <a:fillRect/>
+                    </a:stretch>
+                  </pic:blipFill>
+                  <pic:spPr>
+                    <a:xfrm>
+                      <a:off x="0" y="0"/>
+                      <a:ext cx="5400040" cy="2945765"/>
+                    </a:xfrm>
+                    <a:prstGeom prst="rect">
+                      <a:avLst/>
+                    </a:prstGeom>
+                  </pic:spPr>
+                </pic:pic>
+              </a:graphicData>
+            </a:graphic>
+          </wp:inline>
+        </w:drawing>
+      </w:r>
+    </w:p>
+    <w:p>
+      <w:r>
+        <w:t>Pasados los 8 segundos para establecer velocidad en el motor por arranque estrella, se activan contactos T1 y se desenergiza la bobina KM3 y se energiza la bobina KM2 abriendo la rama de control estrella y e</w:t>
+      </w:r>
+      <w:r>
+        <w:t>nergizando la rama de triangulo, manteniendose autoenclavada con contacto aux.KM1, al desenergizarse bobina de estrella KM3, el contacto NC permite que se energize el rele de contactor triangulo KM3.</w:t>
+      </w:r>
+    </w:p>
+    <w:p>
+      <w:r>
+        <w:drawing>
+          <wp:inline distT="0" distB="0" distL="0" distR="0" wp14:anchorId="5ACC41A4" wp14:editId="6A025C4E">
+            <wp:extent cx="5400040" cy="2987040"/>
+            <wp:effectExtent l="0" t="0" r="0" b="3810"/>
+            <wp:docPr id="1915482536" name="Imagen 1" descr="Diagrama&#10;&#10;El contenido generado por IA puede ser incorrecto."/>
+            <wp:cNvGraphicFramePr>
+              <a:graphicFrameLocks xmlns:a="http://schemas.openxmlformats.org/drawingml/2006/main" noChangeAspect="1"/>
+            </wp:cNvGraphicFramePr>
+            <a:graphic xmlns:a="http://schemas.openxmlformats.org/drawingml/2006/main">
+              <a:graphicData uri="http://schemas.openxmlformats.org/drawingml/2006/picture">
+                <pic:pic xmlns:pic="http://schemas.openxmlformats.org/drawingml/2006/picture">
+                  <pic:nvPicPr>
+                    <pic:cNvPr id="1915482536" name="Imagen 1" descr="Diagrama&#10;&#10;El contenido generado por IA puede ser incorrecto."/>
+                    <pic:cNvPicPr/>
+                  </pic:nvPicPr>
+                  <pic:blipFill>
+                    <a:blip r:embed="rId48"/>
+                    <a:stretch>
+                      <a:fillRect/>
+                    </a:stretch>
+                  </pic:blipFill>
+                  <pic:spPr>
+                    <a:xfrm>
+                      <a:off x="0" y="0"/>
+                      <a:ext cx="5400040" cy="2987040"/>
+                    </a:xfrm>
+                    <a:prstGeom prst="rect">
+                      <a:avLst/>
+                    </a:prstGeom>
+                  </pic:spPr>
+                </pic:pic>
+              </a:graphicData>
+            </a:graphic>
+          </wp:inline>
+        </w:drawing>
+      </w:r>
+    </w:p>
+    <w:p/>
+    <w:p>
+      <w:pPr>
+        <w:jc w:val="center"/>
+      </w:pPr>
     </w:p>
     <w:sectPr>
       <w:pgSz w:w="11906" w:h="16838"/>

</xml_diff>

<commit_message>
Cargue de Clase 6 con memoria set reset y flancos
</commit_message>
<xml_diff>
--- a/Programacion PLC.docx
+++ b/Programacion PLC.docx
@@ -82,7 +82,7 @@
           <w:r>
             <w:fldChar w:fldCharType="separate"/>
           </w:r>
-          <w:hyperlink w:anchor="_Toc235648170" w:history="1">
+          <w:hyperlink w:anchor="_Toc237086475" w:history="1">
             <w:r>
               <w:rPr>
                 <w:rStyle w:val="Hipervnculo"/>
@@ -109,7 +109,7 @@
                 <w:noProof/>
                 <w:webHidden/>
               </w:rPr>
-              <w:instrText xml:space="preserve"> PAGEREF _Toc235648170 \h </w:instrText>
+              <w:instrText xml:space="preserve"> PAGEREF _Toc237086475 \h </w:instrText>
             </w:r>
             <w:r>
               <w:rPr>
@@ -154,7 +154,7 @@
               <w:lang w:eastAsia="es-AR"/>
             </w:rPr>
           </w:pPr>
-          <w:hyperlink w:anchor="_Toc235648171" w:history="1">
+          <w:hyperlink w:anchor="_Toc237086476" w:history="1">
             <w:r>
               <w:rPr>
                 <w:rStyle w:val="Hipervnculo"/>
@@ -181,7 +181,7 @@
                 <w:noProof/>
                 <w:webHidden/>
               </w:rPr>
-              <w:instrText xml:space="preserve"> PAGEREF _Toc235648171 \h </w:instrText>
+              <w:instrText xml:space="preserve"> PAGEREF _Toc237086476 \h </w:instrText>
             </w:r>
             <w:r>
               <w:rPr>
@@ -226,7 +226,7 @@
               <w:lang w:eastAsia="es-AR"/>
             </w:rPr>
           </w:pPr>
-          <w:hyperlink w:anchor="_Toc235648172" w:history="1">
+          <w:hyperlink w:anchor="_Toc237086477" w:history="1">
             <w:r>
               <w:rPr>
                 <w:rStyle w:val="Hipervnculo"/>
@@ -253,7 +253,7 @@
                 <w:noProof/>
                 <w:webHidden/>
               </w:rPr>
-              <w:instrText xml:space="preserve"> PAGEREF _Toc235648172 \h </w:instrText>
+              <w:instrText xml:space="preserve"> PAGEREF _Toc237086477 \h </w:instrText>
             </w:r>
             <w:r>
               <w:rPr>
@@ -298,7 +298,7 @@
               <w:lang w:eastAsia="es-AR"/>
             </w:rPr>
           </w:pPr>
-          <w:hyperlink w:anchor="_Toc235648173" w:history="1">
+          <w:hyperlink w:anchor="_Toc237086478" w:history="1">
             <w:r>
               <w:rPr>
                 <w:rStyle w:val="Hipervnculo"/>
@@ -325,7 +325,7 @@
                 <w:noProof/>
                 <w:webHidden/>
               </w:rPr>
-              <w:instrText xml:space="preserve"> PAGEREF _Toc235648173 \h </w:instrText>
+              <w:instrText xml:space="preserve"> PAGEREF _Toc237086478 \h </w:instrText>
             </w:r>
             <w:r>
               <w:rPr>
@@ -358,7 +358,7 @@
         </w:p>
         <w:p>
           <w:pPr>
-            <w:pStyle w:val="TDC2"/>
+            <w:pStyle w:val="TDC1"/>
             <w:tabs>
               <w:tab w:val="right" w:leader="dot" w:pos="8494"/>
             </w:tabs>
@@ -370,27 +370,13 @@
               <w:lang w:eastAsia="es-AR"/>
             </w:rPr>
           </w:pPr>
-          <w:hyperlink w:anchor="_Toc235648174" w:history="1">
+          <w:hyperlink w:anchor="_Toc237086479" w:history="1">
             <w:r>
               <w:rPr>
                 <w:rStyle w:val="Hipervnculo"/>
                 <w:noProof/>
               </w:rPr>
-              <w:t>Previ</w:t>
-            </w:r>
-            <w:r>
-              <w:rPr>
-                <w:rStyle w:val="Hipervnculo"/>
-                <w:noProof/>
-              </w:rPr>
-              <w:t>o</w:t>
-            </w:r>
-            <w:r>
-              <w:rPr>
-                <w:rStyle w:val="Hipervnculo"/>
-                <w:noProof/>
-              </w:rPr>
-              <w:t xml:space="preserve"> a clase</w:t>
+              <w:t>Clase 4</w:t>
             </w:r>
             <w:r>
               <w:rPr>
@@ -411,7 +397,7 @@
                 <w:noProof/>
                 <w:webHidden/>
               </w:rPr>
-              <w:instrText xml:space="preserve"> PAGEREF _Toc235648174 \h </w:instrText>
+              <w:instrText xml:space="preserve"> PAGEREF _Toc237086479 \h </w:instrText>
             </w:r>
             <w:r>
               <w:rPr>
@@ -431,7 +417,79 @@
                 <w:noProof/>
                 <w:webHidden/>
               </w:rPr>
-              <w:t>7</w:t>
+              <w:t>9</w:t>
+            </w:r>
+            <w:r>
+              <w:rPr>
+                <w:noProof/>
+                <w:webHidden/>
+              </w:rPr>
+              <w:fldChar w:fldCharType="end"/>
+            </w:r>
+          </w:hyperlink>
+        </w:p>
+        <w:p>
+          <w:pPr>
+            <w:pStyle w:val="TDC2"/>
+            <w:tabs>
+              <w:tab w:val="right" w:leader="dot" w:pos="8494"/>
+            </w:tabs>
+            <w:rPr>
+              <w:rFonts w:eastAsiaTheme="minorEastAsia"/>
+              <w:noProof/>
+              <w:sz w:val="24"/>
+              <w:szCs w:val="24"/>
+              <w:lang w:eastAsia="es-AR"/>
+            </w:rPr>
+          </w:pPr>
+          <w:hyperlink w:anchor="_Toc237086480" w:history="1">
+            <w:r>
+              <w:rPr>
+                <w:rStyle w:val="Hipervnculo"/>
+                <w:noProof/>
+              </w:rPr>
+              <w:t>Previo a clase</w:t>
+            </w:r>
+            <w:r>
+              <w:rPr>
+                <w:noProof/>
+                <w:webHidden/>
+              </w:rPr>
+              <w:tab/>
+            </w:r>
+            <w:r>
+              <w:rPr>
+                <w:noProof/>
+                <w:webHidden/>
+              </w:rPr>
+              <w:fldChar w:fldCharType="begin"/>
+            </w:r>
+            <w:r>
+              <w:rPr>
+                <w:noProof/>
+                <w:webHidden/>
+              </w:rPr>
+              <w:instrText xml:space="preserve"> PAGEREF _Toc237086480 \h </w:instrText>
+            </w:r>
+            <w:r>
+              <w:rPr>
+                <w:noProof/>
+                <w:webHidden/>
+              </w:rPr>
+            </w:r>
+            <w:r>
+              <w:rPr>
+                <w:noProof/>
+                <w:webHidden/>
+              </w:rPr>
+              <w:fldChar w:fldCharType="separate"/>
+            </w:r>
+            <w:r>
+              <w:rPr>
+                <w:noProof/>
+                <w:webHidden/>
+              </w:rPr>
+              <w:t>9</w:t>
             </w:r>
             <w:r>
               <w:rPr>
@@ -477,7 +535,7 @@
       <w:pPr>
         <w:pStyle w:val="Ttulo1"/>
       </w:pPr>
-      <w:bookmarkStart w:id="0" w:name="_Toc235648170"/>
+      <w:bookmarkStart w:id="0" w:name="_Toc237086475"/>
       <w:r>
         <w:t>Clase 1</w:t>
       </w:r>
@@ -655,14 +713,14 @@
         <w:t xml:space="preserve"> </w:t>
       </w:r>
       <w:r>
-        <w:t>Es un interruptor electromagnético accionado a distancia, (se acciona por medio de una bobina). El campo magnético atrae un núcleo móvil y cierra los contactos de potencia. También tiene “contactos de control”.</w:t>
-      </w:r>
-      <w:r>
-        <w:t xml:space="preserve">Cuando se energiza su bobina, se </w:t>
+        <w:t xml:space="preserve">Es un interruptor electromagnético accionado a distancia, (se acciona por medio de una bobina). El campo magnético atrae un núcleo móvil y cierra los contactos </w:t>
       </w:r>
       <w:r>
         <w:lastRenderedPageBreak/>
-        <w:t>cierran los 3 contactos y alimenta al motor.</w:t>
+        <w:t>de potencia. También tiene “contactos de control”.</w:t>
+      </w:r>
+      <w:r>
+        <w:t>Cuando se energiza su bobina, se cierran los 3 contactos y alimenta al motor.</w:t>
       </w:r>
       <w:r>
         <w:t xml:space="preserve"> Cuando la bobina deja de energizarse desaparece campo magnético y un resorte devuelve el núcleo a su posición inicial.</w:t>
@@ -2069,7 +2127,7 @@
       <w:pPr>
         <w:pStyle w:val="Ttulo2"/>
       </w:pPr>
-      <w:bookmarkStart w:id="1" w:name="_Toc235648171"/>
+      <w:bookmarkStart w:id="1" w:name="_Toc237086476"/>
       <w:r>
         <w:t>Simulación con CADe_SIMU</w:t>
       </w:r>
@@ -3585,7 +3643,7 @@
       <w:pPr>
         <w:pStyle w:val="Ttulo1"/>
       </w:pPr>
-      <w:bookmarkStart w:id="2" w:name="_Toc235648172"/>
+      <w:bookmarkStart w:id="2" w:name="_Toc237086477"/>
       <w:r>
         <w:t>Clase 2</w:t>
       </w:r>
@@ -3658,12 +3716,11 @@
       <w:pPr>
         <w:pStyle w:val="Ttulo1"/>
       </w:pPr>
-      <w:r>
-        <w:t xml:space="preserve">Clase </w:t>
-      </w:r>
-      <w:r>
-        <w:t>3</w:t>
-      </w:r>
+      <w:bookmarkStart w:id="3" w:name="_Toc237086478"/>
+      <w:r>
+        <w:t>Clase 3</w:t>
+      </w:r>
+      <w:bookmarkEnd w:id="3"/>
     </w:p>
     <w:p>
       <w:r>
@@ -3672,6 +3729,9 @@
     </w:p>
     <w:p>
       <w:r>
+        <w:rPr>
+          <w:noProof/>
+        </w:rPr>
         <w:drawing>
           <wp:inline distT="0" distB="0" distL="0" distR="0" wp14:anchorId="45FA79F2" wp14:editId="654C9B92">
             <wp:extent cx="5400040" cy="3188335"/>
@@ -3716,6 +3776,9 @@
     </w:p>
     <w:p>
       <w:r>
+        <w:rPr>
+          <w:noProof/>
+        </w:rPr>
         <w:lastRenderedPageBreak/>
         <w:drawing>
           <wp:inline distT="0" distB="0" distL="0" distR="0" wp14:anchorId="1CADA91D" wp14:editId="38D1C285">
@@ -3756,14 +3819,14 @@
     </w:p>
     <w:p>
       <w:r>
-        <w:t>Se presiona el pulsador de marcha S2 para energizar bobina KM1 y cerrar contactor de linea del motor con marcha directa. El enclavamiento mantiene energizada bobina de KM1 por contacto KM1 NA</w:t>
-      </w:r>
-      <w:r>
-        <w:t xml:space="preserve"> y enciene led amarillo por contacto KM1.</w:t>
-      </w:r>
-    </w:p>
-    <w:p>
-      <w:r>
+        <w:t>Se presiona el pulsador de marcha S2 para energizar bobina KM1 y cerrar contactor de linea del motor con marcha directa. El enclavamiento mantiene energizada bobina de KM1 por contacto KM1 NA y enciene led amarillo por contacto KM1.</w:t>
+      </w:r>
+    </w:p>
+    <w:p>
+      <w:r>
+        <w:rPr>
+          <w:noProof/>
+        </w:rPr>
         <w:drawing>
           <wp:inline distT="0" distB="0" distL="0" distR="0" wp14:anchorId="63AB8A73" wp14:editId="765041FA">
             <wp:extent cx="5400040" cy="3188335"/>
@@ -4048,6 +4111,9 @@
         </mc:AlternateContent>
       </w:r>
       <w:r>
+        <w:rPr>
+          <w:noProof/>
+        </w:rPr>
         <w:drawing>
           <wp:inline distT="0" distB="0" distL="0" distR="0" wp14:anchorId="614F57C5" wp14:editId="4FF83E89">
             <wp:extent cx="5400040" cy="3135630"/>
@@ -4091,24 +4157,24 @@
       <w:pPr>
         <w:pStyle w:val="Ttulo1"/>
       </w:pPr>
-      <w:bookmarkStart w:id="3" w:name="_Toc235648173"/>
+      <w:bookmarkStart w:id="4" w:name="_Toc237086479"/>
       <w:r>
         <w:t xml:space="preserve">Clase </w:t>
       </w:r>
-      <w:bookmarkEnd w:id="3"/>
       <w:r>
         <w:t>4</w:t>
       </w:r>
+      <w:bookmarkEnd w:id="4"/>
     </w:p>
     <w:p>
       <w:pPr>
         <w:pStyle w:val="Ttulo2"/>
       </w:pPr>
-      <w:bookmarkStart w:id="4" w:name="_Toc235648174"/>
+      <w:bookmarkStart w:id="5" w:name="_Toc237086480"/>
       <w:r>
         <w:t>Previo a clase</w:t>
       </w:r>
-      <w:bookmarkEnd w:id="4"/>
+      <w:bookmarkEnd w:id="5"/>
     </w:p>
     <w:p>
       <w:r>
@@ -4455,6 +4521,9 @@
         <w:br/>
       </w:r>
       <w:r>
+        <w:rPr>
+          <w:noProof/>
+        </w:rPr>
         <w:drawing>
           <wp:inline distT="0" distB="0" distL="0" distR="0" wp14:anchorId="33240E8E" wp14:editId="094F27B2">
             <wp:extent cx="5400040" cy="3096260"/>
@@ -4499,6 +4568,9 @@
     </w:p>
     <w:p>
       <w:r>
+        <w:rPr>
+          <w:noProof/>
+        </w:rPr>
         <w:drawing>
           <wp:inline distT="0" distB="0" distL="0" distR="0" wp14:anchorId="7A3CAF05" wp14:editId="731E42E9">
             <wp:extent cx="5400040" cy="2977515"/>
@@ -4543,6 +4615,9 @@
     </w:p>
     <w:p>
       <w:r>
+        <w:rPr>
+          <w:noProof/>
+        </w:rPr>
         <w:lastRenderedPageBreak/>
         <w:drawing>
           <wp:inline distT="0" distB="0" distL="0" distR="0" wp14:anchorId="4D0596D4" wp14:editId="261DC5C6">
@@ -4591,6 +4666,9 @@
     </w:p>
     <w:p>
       <w:r>
+        <w:rPr>
+          <w:noProof/>
+        </w:rPr>
         <w:drawing>
           <wp:inline distT="0" distB="0" distL="0" distR="0" wp14:anchorId="5ACC41A4" wp14:editId="6A025C4E">
             <wp:extent cx="5400040" cy="2987040"/>
@@ -4629,9 +4707,626 @@
       </w:r>
     </w:p>
     <w:p/>
-    <w:p>
-      <w:pPr>
-        <w:jc w:val="center"/>
+    <w:p/>
+    <w:p/>
+    <w:p/>
+    <w:p>
+      <w:pPr>
+        <w:pStyle w:val="Ttulo1"/>
+      </w:pPr>
+      <w:r>
+        <w:lastRenderedPageBreak/>
+        <w:t xml:space="preserve">Clase </w:t>
+      </w:r>
+      <w:r>
+        <w:t>5</w:t>
+      </w:r>
+    </w:p>
+    <w:p>
+      <w:r>
+        <w:t>Esta primer clase hacemos el primer programa en Ladder y vemos algunas funciones logicas implementadas en dicho lenguaje.</w:t>
+      </w:r>
+      <w:r>
+        <w:rPr>
+          <w:noProof/>
+        </w:rPr>
+        <w:drawing>
+          <wp:inline distT="0" distB="0" distL="0" distR="0" wp14:anchorId="3B2AC4F7" wp14:editId="048EB848">
+            <wp:extent cx="5391150" cy="4045585"/>
+            <wp:effectExtent l="0" t="0" r="0" b="0"/>
+            <wp:docPr id="782738397" name="Imagen 21"/>
+            <wp:cNvGraphicFramePr>
+              <a:graphicFrameLocks xmlns:a="http://schemas.openxmlformats.org/drawingml/2006/main" noChangeAspect="1"/>
+            </wp:cNvGraphicFramePr>
+            <a:graphic xmlns:a="http://schemas.openxmlformats.org/drawingml/2006/main">
+              <a:graphicData uri="http://schemas.openxmlformats.org/drawingml/2006/picture">
+                <pic:pic xmlns:pic="http://schemas.openxmlformats.org/drawingml/2006/picture">
+                  <pic:nvPicPr>
+                    <pic:cNvPr id="0" name="Picture 2"/>
+                    <pic:cNvPicPr>
+                      <a:picLocks noChangeAspect="1" noChangeArrowheads="1"/>
+                    </pic:cNvPicPr>
+                  </pic:nvPicPr>
+                  <pic:blipFill>
+                    <a:blip r:embed="rId49" cstate="print">
+                      <a:extLst>
+                        <a:ext uri="{28A0092B-C50C-407E-A947-70E740481C1C}">
+                          <a14:useLocalDpi xmlns:a14="http://schemas.microsoft.com/office/drawing/2010/main" val="0"/>
+                        </a:ext>
+                      </a:extLst>
+                    </a:blip>
+                    <a:srcRect/>
+                    <a:stretch>
+                      <a:fillRect/>
+                    </a:stretch>
+                  </pic:blipFill>
+                  <pic:spPr bwMode="auto">
+                    <a:xfrm>
+                      <a:off x="0" y="0"/>
+                      <a:ext cx="5391150" cy="4045585"/>
+                    </a:xfrm>
+                    <a:prstGeom prst="rect">
+                      <a:avLst/>
+                    </a:prstGeom>
+                    <a:noFill/>
+                    <a:ln>
+                      <a:noFill/>
+                    </a:ln>
+                  </pic:spPr>
+                </pic:pic>
+              </a:graphicData>
+            </a:graphic>
+          </wp:inline>
+        </w:drawing>
+      </w:r>
+    </w:p>
+    <w:p/>
+    <w:p>
+      <w:pPr>
+        <w:pStyle w:val="Ttulo1"/>
+      </w:pPr>
+      <w:r>
+        <w:br/>
+      </w:r>
+      <w:r>
+        <w:t>Clase 6</w:t>
+      </w:r>
+    </w:p>
+    <w:p>
+      <w:r>
+        <w:t xml:space="preserve">Ejercicio simple de </w:t>
+      </w:r>
+      <w:r>
+        <w:t>SET y RESET</w:t>
+      </w:r>
+      <w:r>
+        <w:t xml:space="preserve"> para hacer arranque directo de motor.</w:t>
+      </w:r>
+    </w:p>
+    <w:p>
+      <w:r>
+        <w:rPr>
+          <w:noProof/>
+        </w:rPr>
+        <w:drawing>
+          <wp:inline distT="0" distB="0" distL="0" distR="0" wp14:anchorId="6111BF72" wp14:editId="68A1BD3C">
+            <wp:extent cx="3114392" cy="2262130"/>
+            <wp:effectExtent l="0" t="0" r="0" b="5080"/>
+            <wp:docPr id="957208023" name="Imagen 20" descr="Imagen que contiene interior, computadora, gato, abrir&#10;&#10;El contenido generado por IA puede ser incorrecto."/>
+            <wp:cNvGraphicFramePr>
+              <a:graphicFrameLocks xmlns:a="http://schemas.openxmlformats.org/drawingml/2006/main" noChangeAspect="1"/>
+            </wp:cNvGraphicFramePr>
+            <a:graphic xmlns:a="http://schemas.openxmlformats.org/drawingml/2006/main">
+              <a:graphicData uri="http://schemas.openxmlformats.org/drawingml/2006/picture">
+                <pic:pic xmlns:pic="http://schemas.openxmlformats.org/drawingml/2006/picture">
+                  <pic:nvPicPr>
+                    <pic:cNvPr id="957208023" name="Imagen 20" descr="Imagen que contiene interior, computadora, gato, abrir&#10;&#10;El contenido generado por IA puede ser incorrecto."/>
+                    <pic:cNvPicPr>
+                      <a:picLocks noChangeAspect="1" noChangeArrowheads="1"/>
+                    </pic:cNvPicPr>
+                  </pic:nvPicPr>
+                  <pic:blipFill rotWithShape="1">
+                    <a:blip r:embed="rId50" cstate="print">
+                      <a:extLst>
+                        <a:ext uri="{28A0092B-C50C-407E-A947-70E740481C1C}">
+                          <a14:useLocalDpi xmlns:a14="http://schemas.microsoft.com/office/drawing/2010/main" val="0"/>
+                        </a:ext>
+                      </a:extLst>
+                    </a:blip>
+                    <a:srcRect l="11500" t="26704" r="27316" b="14073"/>
+                    <a:stretch>
+                      <a:fillRect/>
+                    </a:stretch>
+                  </pic:blipFill>
+                  <pic:spPr bwMode="auto">
+                    <a:xfrm>
+                      <a:off x="0" y="0"/>
+                      <a:ext cx="3122264" cy="2267848"/>
+                    </a:xfrm>
+                    <a:prstGeom prst="rect">
+                      <a:avLst/>
+                    </a:prstGeom>
+                    <a:noFill/>
+                    <a:ln>
+                      <a:noFill/>
+                    </a:ln>
+                    <a:extLst>
+                      <a:ext uri="{53640926-AAD7-44D8-BBD7-CCE9431645EC}">
+                        <a14:shadowObscured xmlns:a14="http://schemas.microsoft.com/office/drawing/2010/main"/>
+                      </a:ext>
+                    </a:extLst>
+                  </pic:spPr>
+                </pic:pic>
+              </a:graphicData>
+            </a:graphic>
+          </wp:inline>
+        </w:drawing>
+      </w:r>
+    </w:p>
+    <w:p/>
+    <w:p/>
+    <w:p>
+      <w:r>
+        <w:t>Ejercicio más complejo utilizando memoria:</w:t>
+      </w:r>
+    </w:p>
+    <w:p>
+      <w:r>
+        <w:rPr>
+          <w:noProof/>
+        </w:rPr>
+        <w:drawing>
+          <wp:inline distT="0" distB="0" distL="0" distR="0" wp14:anchorId="7F21FD92" wp14:editId="6F66C749">
+            <wp:extent cx="4784140" cy="3007672"/>
+            <wp:effectExtent l="0" t="0" r="0" b="2540"/>
+            <wp:docPr id="1113234358" name="Imagen 22"/>
+            <wp:cNvGraphicFramePr>
+              <a:graphicFrameLocks xmlns:a="http://schemas.openxmlformats.org/drawingml/2006/main" noChangeAspect="1"/>
+            </wp:cNvGraphicFramePr>
+            <a:graphic xmlns:a="http://schemas.openxmlformats.org/drawingml/2006/main">
+              <a:graphicData uri="http://schemas.openxmlformats.org/drawingml/2006/picture">
+                <pic:pic xmlns:pic="http://schemas.openxmlformats.org/drawingml/2006/picture">
+                  <pic:nvPicPr>
+                    <pic:cNvPr id="0" name="Picture 3"/>
+                    <pic:cNvPicPr>
+                      <a:picLocks noChangeAspect="1" noChangeArrowheads="1"/>
+                    </pic:cNvPicPr>
+                  </pic:nvPicPr>
+                  <pic:blipFill>
+                    <a:blip r:embed="rId51">
+                      <a:extLst>
+                        <a:ext uri="{28A0092B-C50C-407E-A947-70E740481C1C}">
+                          <a14:useLocalDpi xmlns:a14="http://schemas.microsoft.com/office/drawing/2010/main" val="0"/>
+                        </a:ext>
+                      </a:extLst>
+                    </a:blip>
+                    <a:srcRect/>
+                    <a:stretch>
+                      <a:fillRect/>
+                    </a:stretch>
+                  </pic:blipFill>
+                  <pic:spPr bwMode="auto">
+                    <a:xfrm>
+                      <a:off x="0" y="0"/>
+                      <a:ext cx="4789143" cy="3010817"/>
+                    </a:xfrm>
+                    <a:prstGeom prst="rect">
+                      <a:avLst/>
+                    </a:prstGeom>
+                    <a:noFill/>
+                    <a:ln>
+                      <a:noFill/>
+                    </a:ln>
+                  </pic:spPr>
+                </pic:pic>
+              </a:graphicData>
+            </a:graphic>
+          </wp:inline>
+        </w:drawing>
+      </w:r>
+    </w:p>
+    <w:p>
+      <w:r>
+        <w:t>Implementa control de arranque/parada de motor usando 1 sólo pulsador aprovechando Set, Reset, flancos ascendentes |P| y bit de memoria auxiliares.</w:t>
+      </w:r>
+    </w:p>
+    <w:p>
+      <w:r>
+        <w:t>Con un pulsador normal al pulsar y soltar la señal vuelve a 0. El PLC puede “recordar” si el motor se debe encender o apagar se usa un bit de memoria “M10.1” que guarda el último estado del motor. Así se logra el efecto de “interruptor”.</w:t>
+      </w:r>
+    </w:p>
+    <w:p>
+      <w:r>
+        <w:rPr>
+          <w:b/>
+          <w:bCs/>
+          <w:u w:val="single"/>
+        </w:rPr>
+        <w:t>Rung 1:</w:t>
+      </w:r>
+      <w:r>
+        <w:t xml:space="preserve"> </w:t>
+      </w:r>
+      <w:r>
+        <w:t>Decidir si hacer SET o RESET</w:t>
+      </w:r>
+      <w:r>
+        <w:br/>
+      </w:r>
+      <w:r>
+        <w:br/>
+        <w:t xml:space="preserve">- </w:t>
+      </w:r>
+      <w:r>
+        <w:rPr>
+          <w:b/>
+          <w:bCs/>
+        </w:rPr>
+        <w:t>%I0.0 “MARCHA/PARADA”</w:t>
+      </w:r>
+      <w:r>
+        <w:t xml:space="preserve"> P (detector de flanco positivo). Solo deja pasar un pulso de un ciclo de scan cuando pulso el botón (no se repite la acción mientras mantengo presionado).</w:t>
+      </w:r>
+    </w:p>
+    <w:p>
+      <w:pPr>
+        <w:pStyle w:val="Prrafodelista"/>
+        <w:ind w:left="0"/>
+      </w:pPr>
+      <w:r>
+        <w:t xml:space="preserve">- En serie tiene un contacto </w:t>
+      </w:r>
+      <w:r>
+        <w:rPr>
+          <w:b/>
+          <w:bCs/>
+        </w:rPr>
+        <w:t>NC %M10.1 “M_P”.</w:t>
+      </w:r>
+      <w:r>
+        <w:t xml:space="preserve"> “Si el motor NO estaba encendido antes (M_P = 0), se mantiene cerrado.</w:t>
+      </w:r>
+    </w:p>
+    <w:p>
+      <w:pPr>
+        <w:pStyle w:val="Prrafodelista"/>
+        <w:ind w:left="0"/>
+      </w:pPr>
+      <w:r>
+        <w:t>- Si ambas condiciones se cumplen, se activa Set sobre %Q0.0 “Motor” y se enciende.</w:t>
+      </w:r>
+    </w:p>
+    <w:p>
+      <w:pPr>
+        <w:pStyle w:val="Prrafodelista"/>
+        <w:ind w:left="0"/>
+      </w:pPr>
+      <w:r>
+        <w:t>- El %M10.2 “M_N” es un bit que no se usa en esta logica.</w:t>
+      </w:r>
+    </w:p>
+    <w:p>
+      <w:pPr>
+        <w:pStyle w:val="Prrafodelista"/>
+        <w:ind w:left="0"/>
+      </w:pPr>
+    </w:p>
+    <w:p>
+      <w:pPr>
+        <w:pStyle w:val="Prrafodelista"/>
+        <w:numPr>
+          <w:ilvl w:val="1"/>
+          <w:numId w:val="7"/>
+        </w:numPr>
+        <w:ind w:left="0" w:firstLine="0"/>
+      </w:pPr>
+      <w:r>
+        <w:t>Flanco y M_P= 0 entonces SET MOTOR.</w:t>
+      </w:r>
+      <w:r>
+        <w:br/>
+      </w:r>
+    </w:p>
+    <w:p>
+      <w:pPr>
+        <w:pStyle w:val="Prrafodelista"/>
+        <w:ind w:left="0"/>
+        <w:rPr>
+          <w:b/>
+          <w:bCs/>
+          <w:u w:val="single"/>
+        </w:rPr>
+      </w:pPr>
+      <w:r>
+        <w:rPr>
+          <w:b/>
+          <w:bCs/>
+          <w:u w:val="single"/>
+        </w:rPr>
+        <w:t xml:space="preserve">Rung </w:t>
+      </w:r>
+      <w:r>
+        <w:rPr>
+          <w:b/>
+          <w:bCs/>
+          <w:u w:val="single"/>
+        </w:rPr>
+        <w:t>2</w:t>
+      </w:r>
+      <w:r>
+        <w:rPr>
+          <w:b/>
+          <w:bCs/>
+          <w:u w:val="single"/>
+        </w:rPr>
+        <w:t>:</w:t>
+      </w:r>
+      <w:r>
+        <w:t xml:space="preserve"> </w:t>
+      </w:r>
+      <w:r>
+        <w:t>Decidir si hacer SET o RESET</w:t>
+      </w:r>
+    </w:p>
+    <w:p>
+      <w:pPr>
+        <w:pStyle w:val="Prrafodelista"/>
+        <w:ind w:left="0"/>
+      </w:pPr>
+      <w:r>
+        <w:rPr>
+          <w:b/>
+          <w:bCs/>
+        </w:rPr>
+        <w:t>%M10.1 “M_P”</w:t>
+      </w:r>
+      <w:r>
+        <w:t xml:space="preserve"> ahora como contacto normalmente abierto (si el motor estaba encendido antes) -&gt; Activa el Reset sobre </w:t>
+      </w:r>
+      <w:r>
+        <w:rPr>
+          <w:b/>
+          <w:bCs/>
+        </w:rPr>
+        <w:t>%Q0.0 “MOTOR”,</w:t>
+      </w:r>
+      <w:r>
+        <w:t xml:space="preserve"> o sea apaga el motor.</w:t>
+      </w:r>
+    </w:p>
+    <w:p>
+      <w:pPr>
+        <w:pStyle w:val="Prrafodelista"/>
+        <w:ind w:left="0"/>
+      </w:pPr>
+    </w:p>
+    <w:p>
+      <w:pPr>
+        <w:pStyle w:val="Prrafodelista"/>
+        <w:numPr>
+          <w:ilvl w:val="0"/>
+          <w:numId w:val="6"/>
+        </w:numPr>
+        <w:ind w:left="0" w:hanging="11"/>
+      </w:pPr>
+      <w:r>
+        <w:t>Flanco y M_P = 1 entonces RESET MOTOR</w:t>
+      </w:r>
+    </w:p>
+    <w:p>
+      <w:pPr>
+        <w:pStyle w:val="Prrafodelista"/>
+        <w:ind w:left="0"/>
+      </w:pPr>
+    </w:p>
+    <w:p>
+      <w:pPr>
+        <w:pStyle w:val="Prrafodelista"/>
+        <w:ind w:left="0"/>
+      </w:pPr>
+      <w:r>
+        <w:rPr>
+          <w:b/>
+          <w:bCs/>
+          <w:u w:val="single"/>
+        </w:rPr>
+        <w:t xml:space="preserve">Rung </w:t>
+      </w:r>
+      <w:r>
+        <w:rPr>
+          <w:b/>
+          <w:bCs/>
+          <w:u w:val="single"/>
+        </w:rPr>
+        <w:t>3</w:t>
+      </w:r>
+      <w:r>
+        <w:rPr>
+          <w:b/>
+          <w:bCs/>
+          <w:u w:val="single"/>
+        </w:rPr>
+        <w:t>:</w:t>
+      </w:r>
+      <w:r>
+        <w:t xml:space="preserve"> Detectar motor encendido</w:t>
+      </w:r>
+    </w:p>
+    <w:p>
+      <w:pPr>
+        <w:pStyle w:val="Prrafodelista"/>
+        <w:ind w:left="0"/>
+      </w:pPr>
+      <w:r>
+        <w:rPr>
+          <w:b/>
+          <w:bCs/>
+        </w:rPr>
+        <w:t>%Q0.0 “MOTOR”</w:t>
+      </w:r>
+      <w:r>
+        <w:t xml:space="preserve"> contacto normalmente abierto. Si el motor sí estaba encendido antes, entonces activa Reset sobre </w:t>
+      </w:r>
+      <w:r>
+        <w:rPr>
+          <w:b/>
+          <w:bCs/>
+        </w:rPr>
+        <w:t>%Q0.0 “MOTOR”,</w:t>
+      </w:r>
+      <w:r>
+        <w:t xml:space="preserve"> o sea, apaga el motor.</w:t>
+      </w:r>
+    </w:p>
+    <w:p>
+      <w:pPr>
+        <w:pStyle w:val="Prrafodelista"/>
+        <w:ind w:left="0"/>
+        <w:rPr>
+          <w:b/>
+          <w:bCs/>
+          <w:u w:val="single"/>
+        </w:rPr>
+      </w:pPr>
+    </w:p>
+    <w:p>
+      <w:pPr>
+        <w:pStyle w:val="Prrafodelista"/>
+        <w:numPr>
+          <w:ilvl w:val="0"/>
+          <w:numId w:val="6"/>
+        </w:numPr>
+        <w:rPr>
+          <w:b/>
+          <w:bCs/>
+          <w:u w:val="single"/>
+        </w:rPr>
+      </w:pPr>
+      <w:r>
+        <w:t>Cuando MOTOR = 1 se ejecuta SET M_P, entonces M_P = 1.</w:t>
+      </w:r>
+    </w:p>
+    <w:p>
+      <w:pPr>
+        <w:pStyle w:val="Prrafodelista"/>
+        <w:ind w:left="0"/>
+      </w:pPr>
+      <w:r>
+        <w:rPr>
+          <w:b/>
+          <w:bCs/>
+          <w:u w:val="single"/>
+        </w:rPr>
+        <w:br/>
+      </w:r>
+      <w:r>
+        <w:rPr>
+          <w:b/>
+          <w:bCs/>
+          <w:u w:val="single"/>
+        </w:rPr>
+        <w:t xml:space="preserve">Rung </w:t>
+      </w:r>
+      <w:r>
+        <w:rPr>
+          <w:b/>
+          <w:bCs/>
+          <w:u w:val="single"/>
+        </w:rPr>
+        <w:t>4</w:t>
+      </w:r>
+      <w:r>
+        <w:rPr>
+          <w:b/>
+          <w:bCs/>
+          <w:u w:val="single"/>
+        </w:rPr>
+        <w:t>:</w:t>
+      </w:r>
+      <w:r>
+        <w:t xml:space="preserve"> Detectar motor apagado</w:t>
+      </w:r>
+    </w:p>
+    <w:p>
+      <w:pPr>
+        <w:pStyle w:val="Prrafodelista"/>
+        <w:ind w:left="0"/>
+      </w:pPr>
+      <w:r>
+        <w:rPr>
+          <w:b/>
+          <w:bCs/>
+        </w:rPr>
+        <w:t>%Q0.0 “MOTOR”</w:t>
+      </w:r>
+      <w:r>
+        <w:t xml:space="preserve"> contacto </w:t>
+      </w:r>
+      <w:r>
+        <w:t>NC</w:t>
+      </w:r>
+      <w:r>
+        <w:t xml:space="preserve">. Si el motor está apagado, hace reset de </w:t>
+      </w:r>
+      <w:r>
+        <w:rPr>
+          <w:b/>
+          <w:bCs/>
+        </w:rPr>
+        <w:t>%M10.1 “M_P”,</w:t>
+      </w:r>
+      <w:r>
+        <w:t xml:space="preserve"> guardando que el motor está</w:t>
+      </w:r>
+      <w:r>
+        <w:t xml:space="preserve"> estuvo OFF.</w:t>
+      </w:r>
+    </w:p>
+    <w:p>
+      <w:pPr>
+        <w:pStyle w:val="Prrafodelista"/>
+        <w:ind w:left="0"/>
+      </w:pPr>
+    </w:p>
+    <w:p>
+      <w:pPr>
+        <w:pStyle w:val="Prrafodelista"/>
+        <w:numPr>
+          <w:ilvl w:val="0"/>
+          <w:numId w:val="6"/>
+        </w:numPr>
+        <w:rPr>
+          <w:b/>
+          <w:bCs/>
+          <w:u w:val="single"/>
+        </w:rPr>
+      </w:pPr>
+      <w:r>
+        <w:t xml:space="preserve">Cuando MOTOR = </w:t>
+      </w:r>
+      <w:r>
+        <w:t>0</w:t>
+      </w:r>
+      <w:r>
+        <w:t xml:space="preserve"> se ejecuta </w:t>
+      </w:r>
+      <w:r>
+        <w:t>RE</w:t>
+      </w:r>
+      <w:r>
+        <w:t xml:space="preserve">SET M_P, entonces M_P = </w:t>
+      </w:r>
+      <w:r>
+        <w:t>0</w:t>
+      </w:r>
+      <w:r>
+        <w:t>.</w:t>
+      </w:r>
+    </w:p>
+    <w:p>
+      <w:pPr>
+        <w:pStyle w:val="Prrafodelista"/>
+        <w:ind w:left="0"/>
       </w:pPr>
     </w:p>
     <w:sectPr>
@@ -4760,6 +5455,230 @@
     </w:lvl>
   </w:abstractNum>
   <w:abstractNum w:abstractNumId="1" w15:restartNumberingAfterBreak="0">
+    <w:nsid w:val="1BE260F8"/>
+    <w:multiLevelType w:val="hybridMultilevel"/>
+    <w:tmpl w:val="FF9CBAE6"/>
+    <w:lvl w:ilvl="0" w:tplc="6E4E284C">
+      <w:numFmt w:val="bullet"/>
+      <w:lvlText w:val=""/>
+      <w:lvlJc w:val="left"/>
+      <w:pPr>
+        <w:ind w:left="720" w:hanging="360"/>
+      </w:pPr>
+      <w:rPr>
+        <w:rFonts w:ascii="Wingdings" w:eastAsiaTheme="minorHAnsi" w:hAnsi="Wingdings" w:cstheme="minorBidi" w:hint="default"/>
+      </w:rPr>
+    </w:lvl>
+    <w:lvl w:ilvl="1" w:tplc="2C0A0003" w:tentative="1">
+      <w:start w:val="1"/>
+      <w:numFmt w:val="bullet"/>
+      <w:lvlText w:val="o"/>
+      <w:lvlJc w:val="left"/>
+      <w:pPr>
+        <w:ind w:left="1440" w:hanging="360"/>
+      </w:pPr>
+      <w:rPr>
+        <w:rFonts w:ascii="Courier New" w:hAnsi="Courier New" w:cs="Courier New" w:hint="default"/>
+      </w:rPr>
+    </w:lvl>
+    <w:lvl w:ilvl="2" w:tplc="2C0A0005" w:tentative="1">
+      <w:start w:val="1"/>
+      <w:numFmt w:val="bullet"/>
+      <w:lvlText w:val=""/>
+      <w:lvlJc w:val="left"/>
+      <w:pPr>
+        <w:ind w:left="2160" w:hanging="360"/>
+      </w:pPr>
+      <w:rPr>
+        <w:rFonts w:ascii="Wingdings" w:hAnsi="Wingdings" w:hint="default"/>
+      </w:rPr>
+    </w:lvl>
+    <w:lvl w:ilvl="3" w:tplc="2C0A0001" w:tentative="1">
+      <w:start w:val="1"/>
+      <w:numFmt w:val="bullet"/>
+      <w:lvlText w:val=""/>
+      <w:lvlJc w:val="left"/>
+      <w:pPr>
+        <w:ind w:left="2880" w:hanging="360"/>
+      </w:pPr>
+      <w:rPr>
+        <w:rFonts w:ascii="Symbol" w:hAnsi="Symbol" w:hint="default"/>
+      </w:rPr>
+    </w:lvl>
+    <w:lvl w:ilvl="4" w:tplc="2C0A0003" w:tentative="1">
+      <w:start w:val="1"/>
+      <w:numFmt w:val="bullet"/>
+      <w:lvlText w:val="o"/>
+      <w:lvlJc w:val="left"/>
+      <w:pPr>
+        <w:ind w:left="3600" w:hanging="360"/>
+      </w:pPr>
+      <w:rPr>
+        <w:rFonts w:ascii="Courier New" w:hAnsi="Courier New" w:cs="Courier New" w:hint="default"/>
+      </w:rPr>
+    </w:lvl>
+    <w:lvl w:ilvl="5" w:tplc="2C0A0005" w:tentative="1">
+      <w:start w:val="1"/>
+      <w:numFmt w:val="bullet"/>
+      <w:lvlText w:val=""/>
+      <w:lvlJc w:val="left"/>
+      <w:pPr>
+        <w:ind w:left="4320" w:hanging="360"/>
+      </w:pPr>
+      <w:rPr>
+        <w:rFonts w:ascii="Wingdings" w:hAnsi="Wingdings" w:hint="default"/>
+      </w:rPr>
+    </w:lvl>
+    <w:lvl w:ilvl="6" w:tplc="2C0A0001" w:tentative="1">
+      <w:start w:val="1"/>
+      <w:numFmt w:val="bullet"/>
+      <w:lvlText w:val=""/>
+      <w:lvlJc w:val="left"/>
+      <w:pPr>
+        <w:ind w:left="5040" w:hanging="360"/>
+      </w:pPr>
+      <w:rPr>
+        <w:rFonts w:ascii="Symbol" w:hAnsi="Symbol" w:hint="default"/>
+      </w:rPr>
+    </w:lvl>
+    <w:lvl w:ilvl="7" w:tplc="2C0A0003" w:tentative="1">
+      <w:start w:val="1"/>
+      <w:numFmt w:val="bullet"/>
+      <w:lvlText w:val="o"/>
+      <w:lvlJc w:val="left"/>
+      <w:pPr>
+        <w:ind w:left="5760" w:hanging="360"/>
+      </w:pPr>
+      <w:rPr>
+        <w:rFonts w:ascii="Courier New" w:hAnsi="Courier New" w:cs="Courier New" w:hint="default"/>
+      </w:rPr>
+    </w:lvl>
+    <w:lvl w:ilvl="8" w:tplc="2C0A0005" w:tentative="1">
+      <w:start w:val="1"/>
+      <w:numFmt w:val="bullet"/>
+      <w:lvlText w:val=""/>
+      <w:lvlJc w:val="left"/>
+      <w:pPr>
+        <w:ind w:left="6480" w:hanging="360"/>
+      </w:pPr>
+      <w:rPr>
+        <w:rFonts w:ascii="Wingdings" w:hAnsi="Wingdings" w:hint="default"/>
+      </w:rPr>
+    </w:lvl>
+  </w:abstractNum>
+  <w:abstractNum w:abstractNumId="2" w15:restartNumberingAfterBreak="0">
+    <w:nsid w:val="1C202C8F"/>
+    <w:multiLevelType w:val="hybridMultilevel"/>
+    <w:tmpl w:val="EACAF556"/>
+    <w:lvl w:ilvl="0" w:tplc="DC3CA2C4">
+      <w:numFmt w:val="bullet"/>
+      <w:lvlText w:val="-"/>
+      <w:lvlJc w:val="left"/>
+      <w:pPr>
+        <w:ind w:left="720" w:hanging="360"/>
+      </w:pPr>
+      <w:rPr>
+        <w:rFonts w:ascii="Aptos" w:eastAsiaTheme="minorHAnsi" w:hAnsi="Aptos" w:cstheme="minorBidi" w:hint="default"/>
+      </w:rPr>
+    </w:lvl>
+    <w:lvl w:ilvl="1" w:tplc="2C0A0003" w:tentative="1">
+      <w:start w:val="1"/>
+      <w:numFmt w:val="bullet"/>
+      <w:lvlText w:val="o"/>
+      <w:lvlJc w:val="left"/>
+      <w:pPr>
+        <w:ind w:left="1440" w:hanging="360"/>
+      </w:pPr>
+      <w:rPr>
+        <w:rFonts w:ascii="Courier New" w:hAnsi="Courier New" w:cs="Courier New" w:hint="default"/>
+      </w:rPr>
+    </w:lvl>
+    <w:lvl w:ilvl="2" w:tplc="2C0A0005" w:tentative="1">
+      <w:start w:val="1"/>
+      <w:numFmt w:val="bullet"/>
+      <w:lvlText w:val=""/>
+      <w:lvlJc w:val="left"/>
+      <w:pPr>
+        <w:ind w:left="2160" w:hanging="360"/>
+      </w:pPr>
+      <w:rPr>
+        <w:rFonts w:ascii="Wingdings" w:hAnsi="Wingdings" w:hint="default"/>
+      </w:rPr>
+    </w:lvl>
+    <w:lvl w:ilvl="3" w:tplc="2C0A0001" w:tentative="1">
+      <w:start w:val="1"/>
+      <w:numFmt w:val="bullet"/>
+      <w:lvlText w:val=""/>
+      <w:lvlJc w:val="left"/>
+      <w:pPr>
+        <w:ind w:left="2880" w:hanging="360"/>
+      </w:pPr>
+      <w:rPr>
+        <w:rFonts w:ascii="Symbol" w:hAnsi="Symbol" w:hint="default"/>
+      </w:rPr>
+    </w:lvl>
+    <w:lvl w:ilvl="4" w:tplc="2C0A0003" w:tentative="1">
+      <w:start w:val="1"/>
+      <w:numFmt w:val="bullet"/>
+      <w:lvlText w:val="o"/>
+      <w:lvlJc w:val="left"/>
+      <w:pPr>
+        <w:ind w:left="3600" w:hanging="360"/>
+      </w:pPr>
+      <w:rPr>
+        <w:rFonts w:ascii="Courier New" w:hAnsi="Courier New" w:cs="Courier New" w:hint="default"/>
+      </w:rPr>
+    </w:lvl>
+    <w:lvl w:ilvl="5" w:tplc="2C0A0005" w:tentative="1">
+      <w:start w:val="1"/>
+      <w:numFmt w:val="bullet"/>
+      <w:lvlText w:val=""/>
+      <w:lvlJc w:val="left"/>
+      <w:pPr>
+        <w:ind w:left="4320" w:hanging="360"/>
+      </w:pPr>
+      <w:rPr>
+        <w:rFonts w:ascii="Wingdings" w:hAnsi="Wingdings" w:hint="default"/>
+      </w:rPr>
+    </w:lvl>
+    <w:lvl w:ilvl="6" w:tplc="2C0A0001" w:tentative="1">
+      <w:start w:val="1"/>
+      <w:numFmt w:val="bullet"/>
+      <w:lvlText w:val=""/>
+      <w:lvlJc w:val="left"/>
+      <w:pPr>
+        <w:ind w:left="5040" w:hanging="360"/>
+      </w:pPr>
+      <w:rPr>
+        <w:rFonts w:ascii="Symbol" w:hAnsi="Symbol" w:hint="default"/>
+      </w:rPr>
+    </w:lvl>
+    <w:lvl w:ilvl="7" w:tplc="2C0A0003" w:tentative="1">
+      <w:start w:val="1"/>
+      <w:numFmt w:val="bullet"/>
+      <w:lvlText w:val="o"/>
+      <w:lvlJc w:val="left"/>
+      <w:pPr>
+        <w:ind w:left="5760" w:hanging="360"/>
+      </w:pPr>
+      <w:rPr>
+        <w:rFonts w:ascii="Courier New" w:hAnsi="Courier New" w:cs="Courier New" w:hint="default"/>
+      </w:rPr>
+    </w:lvl>
+    <w:lvl w:ilvl="8" w:tplc="2C0A0005" w:tentative="1">
+      <w:start w:val="1"/>
+      <w:numFmt w:val="bullet"/>
+      <w:lvlText w:val=""/>
+      <w:lvlJc w:val="left"/>
+      <w:pPr>
+        <w:ind w:left="6480" w:hanging="360"/>
+      </w:pPr>
+      <w:rPr>
+        <w:rFonts w:ascii="Wingdings" w:hAnsi="Wingdings" w:hint="default"/>
+      </w:rPr>
+    </w:lvl>
+  </w:abstractNum>
+  <w:abstractNum w:abstractNumId="3" w15:restartNumberingAfterBreak="0">
     <w:nsid w:val="343E79BA"/>
     <w:multiLevelType w:val="hybridMultilevel"/>
     <w:tmpl w:val="70E68364"/>
@@ -4872,7 +5791,118 @@
       </w:rPr>
     </w:lvl>
   </w:abstractNum>
-  <w:abstractNum w:abstractNumId="2" w15:restartNumberingAfterBreak="0">
+  <w:abstractNum w:abstractNumId="4" w15:restartNumberingAfterBreak="0">
+    <w:nsid w:val="3FAB507A"/>
+    <w:multiLevelType w:val="hybridMultilevel"/>
+    <w:tmpl w:val="7F929C0A"/>
+    <w:lvl w:ilvl="0" w:tplc="6E4E284C">
+      <w:numFmt w:val="bullet"/>
+      <w:lvlText w:val=""/>
+      <w:lvlJc w:val="left"/>
+      <w:pPr>
+        <w:ind w:left="720" w:hanging="360"/>
+      </w:pPr>
+      <w:rPr>
+        <w:rFonts w:ascii="Wingdings" w:eastAsiaTheme="minorHAnsi" w:hAnsi="Wingdings" w:cstheme="minorBidi" w:hint="default"/>
+      </w:rPr>
+    </w:lvl>
+    <w:lvl w:ilvl="1" w:tplc="6E4E284C">
+      <w:numFmt w:val="bullet"/>
+      <w:lvlText w:val=""/>
+      <w:lvlJc w:val="left"/>
+      <w:pPr>
+        <w:ind w:left="1440" w:hanging="360"/>
+      </w:pPr>
+      <w:rPr>
+        <w:rFonts w:ascii="Wingdings" w:eastAsiaTheme="minorHAnsi" w:hAnsi="Wingdings" w:cstheme="minorBidi" w:hint="default"/>
+      </w:rPr>
+    </w:lvl>
+    <w:lvl w:ilvl="2" w:tplc="2C0A0005" w:tentative="1">
+      <w:start w:val="1"/>
+      <w:numFmt w:val="bullet"/>
+      <w:lvlText w:val=""/>
+      <w:lvlJc w:val="left"/>
+      <w:pPr>
+        <w:ind w:left="2160" w:hanging="360"/>
+      </w:pPr>
+      <w:rPr>
+        <w:rFonts w:ascii="Wingdings" w:hAnsi="Wingdings" w:hint="default"/>
+      </w:rPr>
+    </w:lvl>
+    <w:lvl w:ilvl="3" w:tplc="2C0A0001" w:tentative="1">
+      <w:start w:val="1"/>
+      <w:numFmt w:val="bullet"/>
+      <w:lvlText w:val=""/>
+      <w:lvlJc w:val="left"/>
+      <w:pPr>
+        <w:ind w:left="2880" w:hanging="360"/>
+      </w:pPr>
+      <w:rPr>
+        <w:rFonts w:ascii="Symbol" w:hAnsi="Symbol" w:hint="default"/>
+      </w:rPr>
+    </w:lvl>
+    <w:lvl w:ilvl="4" w:tplc="2C0A0003" w:tentative="1">
+      <w:start w:val="1"/>
+      <w:numFmt w:val="bullet"/>
+      <w:lvlText w:val="o"/>
+      <w:lvlJc w:val="left"/>
+      <w:pPr>
+        <w:ind w:left="3600" w:hanging="360"/>
+      </w:pPr>
+      <w:rPr>
+        <w:rFonts w:ascii="Courier New" w:hAnsi="Courier New" w:cs="Courier New" w:hint="default"/>
+      </w:rPr>
+    </w:lvl>
+    <w:lvl w:ilvl="5" w:tplc="2C0A0005" w:tentative="1">
+      <w:start w:val="1"/>
+      <w:numFmt w:val="bullet"/>
+      <w:lvlText w:val=""/>
+      <w:lvlJc w:val="left"/>
+      <w:pPr>
+        <w:ind w:left="4320" w:hanging="360"/>
+      </w:pPr>
+      <w:rPr>
+        <w:rFonts w:ascii="Wingdings" w:hAnsi="Wingdings" w:hint="default"/>
+      </w:rPr>
+    </w:lvl>
+    <w:lvl w:ilvl="6" w:tplc="2C0A0001" w:tentative="1">
+      <w:start w:val="1"/>
+      <w:numFmt w:val="bullet"/>
+      <w:lvlText w:val=""/>
+      <w:lvlJc w:val="left"/>
+      <w:pPr>
+        <w:ind w:left="5040" w:hanging="360"/>
+      </w:pPr>
+      <w:rPr>
+        <w:rFonts w:ascii="Symbol" w:hAnsi="Symbol" w:hint="default"/>
+      </w:rPr>
+    </w:lvl>
+    <w:lvl w:ilvl="7" w:tplc="2C0A0003" w:tentative="1">
+      <w:start w:val="1"/>
+      <w:numFmt w:val="bullet"/>
+      <w:lvlText w:val="o"/>
+      <w:lvlJc w:val="left"/>
+      <w:pPr>
+        <w:ind w:left="5760" w:hanging="360"/>
+      </w:pPr>
+      <w:rPr>
+        <w:rFonts w:ascii="Courier New" w:hAnsi="Courier New" w:cs="Courier New" w:hint="default"/>
+      </w:rPr>
+    </w:lvl>
+    <w:lvl w:ilvl="8" w:tplc="2C0A0005" w:tentative="1">
+      <w:start w:val="1"/>
+      <w:numFmt w:val="bullet"/>
+      <w:lvlText w:val=""/>
+      <w:lvlJc w:val="left"/>
+      <w:pPr>
+        <w:ind w:left="6480" w:hanging="360"/>
+      </w:pPr>
+      <w:rPr>
+        <w:rFonts w:ascii="Wingdings" w:hAnsi="Wingdings" w:hint="default"/>
+      </w:rPr>
+    </w:lvl>
+  </w:abstractNum>
+  <w:abstractNum w:abstractNumId="5" w15:restartNumberingAfterBreak="0">
     <w:nsid w:val="70DD2AEE"/>
     <w:multiLevelType w:val="hybridMultilevel"/>
     <w:tmpl w:val="478E8FE2"/>
@@ -4985,10 +6015,10 @@
       </w:rPr>
     </w:lvl>
   </w:abstractNum>
-  <w:abstractNum w:abstractNumId="3" w15:restartNumberingAfterBreak="0">
+  <w:abstractNum w:abstractNumId="6" w15:restartNumberingAfterBreak="0">
     <w:nsid w:val="7A58465B"/>
     <w:multiLevelType w:val="hybridMultilevel"/>
-    <w:tmpl w:val="C068DB6C"/>
+    <w:tmpl w:val="D2188698"/>
     <w:lvl w:ilvl="0" w:tplc="2C0A0001">
       <w:start w:val="1"/>
       <w:numFmt w:val="bullet"/>
@@ -5001,16 +6031,15 @@
         <w:rFonts w:ascii="Symbol" w:hAnsi="Symbol" w:hint="default"/>
       </w:rPr>
     </w:lvl>
-    <w:lvl w:ilvl="1" w:tplc="2C0A0003" w:tentative="1">
-      <w:start w:val="1"/>
+    <w:lvl w:ilvl="1" w:tplc="123E2482">
       <w:numFmt w:val="bullet"/>
-      <w:lvlText w:val="o"/>
+      <w:lvlText w:val=""/>
       <w:lvlJc w:val="left"/>
       <w:pPr>
         <w:ind w:left="1440" w:hanging="360"/>
       </w:pPr>
       <w:rPr>
-        <w:rFonts w:ascii="Courier New" w:hAnsi="Courier New" w:cs="Courier New" w:hint="default"/>
+        <w:rFonts w:ascii="Wingdings" w:eastAsiaTheme="minorHAnsi" w:hAnsi="Wingdings" w:cstheme="minorBidi" w:hint="default"/>
       </w:rPr>
     </w:lvl>
     <w:lvl w:ilvl="2" w:tplc="2C0A0005" w:tentative="1">
@@ -5099,16 +6128,25 @@
     </w:lvl>
   </w:abstractNum>
   <w:num w:numId="1" w16cid:durableId="1784493686">
+    <w:abstractNumId w:val="6"/>
+  </w:num>
+  <w:num w:numId="2" w16cid:durableId="937560769">
     <w:abstractNumId w:val="3"/>
   </w:num>
-  <w:num w:numId="2" w16cid:durableId="937560769">
-    <w:abstractNumId w:val="1"/>
-  </w:num>
   <w:num w:numId="3" w16cid:durableId="1034161628">
-    <w:abstractNumId w:val="2"/>
+    <w:abstractNumId w:val="5"/>
   </w:num>
   <w:num w:numId="4" w16cid:durableId="1839886123">
     <w:abstractNumId w:val="0"/>
+  </w:num>
+  <w:num w:numId="5" w16cid:durableId="1870875592">
+    <w:abstractNumId w:val="2"/>
+  </w:num>
+  <w:num w:numId="6" w16cid:durableId="1734112518">
+    <w:abstractNumId w:val="1"/>
+  </w:num>
+  <w:num w:numId="7" w16cid:durableId="2017490873">
+    <w:abstractNumId w:val="4"/>
   </w:num>
 </w:numbering>
 </file>

</xml_diff>